<commit_message>
Upd with char editor
</commit_message>
<xml_diff>
--- a/design/character-system.docx
+++ b/design/character-system.docx
@@ -598,7 +598,13 @@
               <w:t xml:space="preserve"> Points</w:t>
             </w:r>
             <w:r>
-              <w:t>, 5 Skill Points</w:t>
+              <w:t xml:space="preserve">, </w:t>
+            </w:r>
+            <w:r>
+              <w:t>2</w:t>
+            </w:r>
+            <w:r>
+              <w:t xml:space="preserve"> Skill Points</w:t>
             </w:r>
           </w:p>
         </w:tc>

</xml_diff>

<commit_message>
Group saves by shared id, add modal for loading, add name display
</commit_message>
<xml_diff>
--- a/design/character-system.docx
+++ b/design/character-system.docx
@@ -345,86 +345,10 @@
     </w:p>
     <w:p>
       <w:pPr>
-        <w:pStyle w:val="Heading3"/>
+        <w:pStyle w:val="Heading2"/>
       </w:pPr>
       <w:r>
         <w:lastRenderedPageBreak/>
-        <w:t>Scaling</w:t>
-      </w:r>
-    </w:p>
-    <w:p>
-      <w:r>
-        <w:t xml:space="preserve">Since XP is based on encounters and not the enemies within them, </w:t>
-      </w:r>
-      <w:r>
-        <w:rPr>
-          <w:highlight w:val="yellow"/>
-        </w:rPr>
-        <w:t>TODO</w:t>
-      </w:r>
-    </w:p>
-    <w:p>
-      <w:pPr>
-        <w:rPr>
-          <w:i/>
-          <w:iCs/>
-        </w:rPr>
-      </w:pPr>
-      <w:r>
-        <w:rPr>
-          <w:i/>
-          <w:iCs/>
-        </w:rPr>
-        <w:t>Idea: Have a shorthand for XP, like 1 "story point"</w:t>
-      </w:r>
-      <w:r>
-        <w:rPr>
-          <w:i/>
-          <w:iCs/>
-        </w:rPr>
-        <w:t xml:space="preserve">? And scale up the value of a story point later since XP is </w:t>
-      </w:r>
-      <w:r>
-        <w:rPr>
-          <w:i/>
-          <w:iCs/>
-        </w:rPr>
-        <w:t>just</w:t>
-      </w:r>
-      <w:r>
-        <w:rPr>
-          <w:i/>
-          <w:iCs/>
-        </w:rPr>
-        <w:t xml:space="preserve"> a visual flair</w:t>
-      </w:r>
-      <w:r>
-        <w:rPr>
-          <w:i/>
-          <w:iCs/>
-        </w:rPr>
-        <w:t xml:space="preserve"> to give the good feeling of "number go up"</w:t>
-      </w:r>
-      <w:r>
-        <w:rPr>
-          <w:i/>
-          <w:iCs/>
-        </w:rPr>
-        <w:t>.</w:t>
-      </w:r>
-      <w:r>
-        <w:rPr>
-          <w:i/>
-          <w:iCs/>
-        </w:rPr>
-        <w:t xml:space="preserve"> AKA, a story point is worth 100xp at the beginning, but 1000xp later?</w:t>
-      </w:r>
-    </w:p>
-    <w:p>
-      <w:pPr>
-        <w:pStyle w:val="Heading2"/>
-      </w:pPr>
-      <w:r>
         <w:t>Experience</w:t>
       </w:r>
     </w:p>
@@ -1575,6 +1499,40 @@
         </w:tc>
       </w:tr>
     </w:tbl>
+    <w:p>
+      <w:pPr>
+        <w:pStyle w:val="Heading3"/>
+      </w:pPr>
+      <w:r>
+        <w:t>Scaling</w:t>
+      </w:r>
+    </w:p>
+    <w:p>
+      <w:r>
+        <w:t xml:space="preserve">Since XP is based on encounters and not the enemies within them, </w:t>
+      </w:r>
+      <w:r>
+        <w:rPr>
+          <w:highlight w:val="yellow"/>
+        </w:rPr>
+        <w:t>TODO</w:t>
+      </w:r>
+    </w:p>
+    <w:p>
+      <w:pPr>
+        <w:rPr>
+          <w:i/>
+          <w:iCs/>
+        </w:rPr>
+      </w:pPr>
+      <w:r>
+        <w:rPr>
+          <w:i/>
+          <w:iCs/>
+        </w:rPr>
+        <w:t>Idea: Have a shorthand for XP, like 1 "story point"? And scale up the value of a story point later since XP is just a visual flair to give the good feeling of "number go up". AKA, a story point is worth 100xp at the beginning, but 1000xp later?</w:t>
+      </w:r>
+    </w:p>
     <w:p>
       <w:pPr>
         <w:rPr>
@@ -4158,11 +4116,7 @@
         </w:tc>
       </w:tr>
     </w:tbl>
-    <w:p>
-      <w:pPr>
-        <w:pStyle w:val="Heading3"/>
-      </w:pPr>
-    </w:p>
+    <w:p/>
     <w:p>
       <w:pPr>
         <w:rPr>
@@ -4317,33 +4271,59 @@
             <w:tcW w:w="3714" w:type="dxa"/>
           </w:tcPr>
           <w:p>
+            <w:r>
+              <w:t>Attack</w:t>
+            </w:r>
+          </w:p>
+        </w:tc>
+        <w:tc>
+          <w:tcPr>
+            <w:tcW w:w="1141" w:type="dxa"/>
+          </w:tcPr>
+          <w:p>
+            <w:r>
+              <w:t>A</w:t>
+            </w:r>
+          </w:p>
+        </w:tc>
+        <w:tc>
+          <w:tcPr>
+            <w:tcW w:w="4495" w:type="dxa"/>
+          </w:tcPr>
+          <w:p>
+            <w:r>
+              <w:t>C</w:t>
+            </w:r>
+            <w:r>
+              <w:t xml:space="preserve">hance to hit </w:t>
+            </w:r>
+            <w:r>
+              <w:t>targets</w:t>
+            </w:r>
+            <w:r>
+              <w:t xml:space="preserve"> during an attack roll</w:t>
+            </w:r>
+          </w:p>
+          <w:p>
             <w:pPr>
               <w:rPr>
-                <w:vertAlign w:val="superscript"/>
+                <w:i/>
+                <w:iCs/>
               </w:rPr>
             </w:pPr>
             <w:r>
-              <w:t>Armor Rating</w:t>
-            </w:r>
-          </w:p>
-        </w:tc>
-        <w:tc>
-          <w:tcPr>
-            <w:tcW w:w="1141" w:type="dxa"/>
-          </w:tcPr>
-          <w:p>
-            <w:r>
-              <w:t>T</w:t>
-            </w:r>
-          </w:p>
-        </w:tc>
-        <w:tc>
-          <w:tcPr>
-            <w:tcW w:w="4495" w:type="dxa"/>
-          </w:tcPr>
-          <w:p>
-            <w:r>
-              <w:t>Armor</w:t>
+              <w:rPr>
+                <w:i/>
+                <w:iCs/>
+              </w:rPr>
+              <w:t xml:space="preserve">Base: </w:t>
+            </w:r>
+            <w:r>
+              <w:rPr>
+                <w:i/>
+                <w:iCs/>
+              </w:rPr>
+              <w:t>6 + (Brawn + Agility) / 2</w:t>
             </w:r>
           </w:p>
         </w:tc>
@@ -4358,7 +4338,7 @@
           </w:tcPr>
           <w:p>
             <w:r>
-              <w:t>Attack</w:t>
+              <w:t>Defense</w:t>
             </w:r>
           </w:p>
         </w:tc>
@@ -4368,7 +4348,7 @@
           </w:tcPr>
           <w:p>
             <w:r>
-              <w:t>A</w:t>
+              <w:t>D</w:t>
             </w:r>
           </w:p>
         </w:tc>
@@ -4378,10 +4358,42 @@
           </w:tcPr>
           <w:p>
             <w:r>
-              <w:t>Improved c</w:t>
-            </w:r>
-            <w:r>
-              <w:t>hance to hit enemies</w:t>
+              <w:t>C</w:t>
+            </w:r>
+            <w:r>
+              <w:t>hance to avoid physical attacks</w:t>
+            </w:r>
+            <w:r>
+              <w:t xml:space="preserve"> when the target of an attack</w:t>
+            </w:r>
+          </w:p>
+          <w:p>
+            <w:pPr>
+              <w:rPr>
+                <w:i/>
+                <w:iCs/>
+              </w:rPr>
+            </w:pPr>
+            <w:r>
+              <w:rPr>
+                <w:i/>
+                <w:iCs/>
+              </w:rPr>
+              <w:t xml:space="preserve">Base: </w:t>
+            </w:r>
+            <w:r>
+              <w:rPr>
+                <w:i/>
+                <w:iCs/>
+              </w:rPr>
+              <w:t xml:space="preserve">6 + </w:t>
+            </w:r>
+            <w:r>
+              <w:rPr>
+                <w:i/>
+                <w:iCs/>
+              </w:rPr>
+              <w:t>Brawn</w:t>
             </w:r>
           </w:p>
         </w:tc>
@@ -4393,7 +4405,7 @@
           </w:tcPr>
           <w:p>
             <w:r>
-              <w:t>Defense</w:t>
+              <w:t>Critical Chance</w:t>
             </w:r>
           </w:p>
         </w:tc>
@@ -4403,7 +4415,7 @@
           </w:tcPr>
           <w:p>
             <w:r>
-              <w:t>D</w:t>
+              <w:t>C</w:t>
             </w:r>
           </w:p>
         </w:tc>
@@ -4413,10 +4425,36 @@
           </w:tcPr>
           <w:p>
             <w:r>
-              <w:t>Improved c</w:t>
-            </w:r>
-            <w:r>
-              <w:t>hance to avoid physical attacks</w:t>
+              <w:t>Chance to hit a critical</w:t>
+            </w:r>
+          </w:p>
+          <w:p>
+            <w:pPr>
+              <w:rPr>
+                <w:i/>
+                <w:iCs/>
+              </w:rPr>
+            </w:pPr>
+            <w:r>
+              <w:rPr>
+                <w:i/>
+                <w:iCs/>
+              </w:rPr>
+              <w:t xml:space="preserve">Base: </w:t>
+            </w:r>
+            <w:r>
+              <w:rPr>
+                <w:i/>
+                <w:iCs/>
+              </w:rPr>
+              <w:t>Agility</w:t>
+            </w:r>
+            <w:r>
+              <w:rPr>
+                <w:i/>
+                <w:iCs/>
+              </w:rPr>
+              <w:t xml:space="preserve"> + 2</w:t>
             </w:r>
           </w:p>
         </w:tc>
@@ -4431,7 +4469,7 @@
           </w:tcPr>
           <w:p>
             <w:r>
-              <w:t>Critical Chance</w:t>
+              <w:t>Critical Damage Multiplier</w:t>
             </w:r>
           </w:p>
         </w:tc>
@@ -4443,6 +4481,12 @@
             <w:r>
               <w:t>C</w:t>
             </w:r>
+            <w:r>
+              <w:rPr>
+                <w:vertAlign w:val="superscript"/>
+              </w:rPr>
+              <w:t>M</w:t>
+            </w:r>
           </w:p>
         </w:tc>
         <w:tc>
@@ -4451,7 +4495,36 @@
           </w:tcPr>
           <w:p>
             <w:r>
-              <w:t>Chance to hit a critical</w:t>
+              <w:t>Multiplier applied when a critical hit occurs</w:t>
+            </w:r>
+          </w:p>
+          <w:p>
+            <w:pPr>
+              <w:rPr>
+                <w:i/>
+                <w:iCs/>
+              </w:rPr>
+            </w:pPr>
+            <w:r>
+              <w:rPr>
+                <w:i/>
+                <w:iCs/>
+              </w:rPr>
+              <w:t xml:space="preserve">Base: </w:t>
+            </w:r>
+            <w:r>
+              <w:rPr>
+                <w:i/>
+                <w:iCs/>
+              </w:rPr>
+              <w:t>150</w:t>
+            </w:r>
+            <w:r>
+              <w:rPr>
+                <w:i/>
+                <w:iCs/>
+              </w:rPr>
+              <w:t>%</w:t>
             </w:r>
           </w:p>
         </w:tc>
@@ -4463,7 +4536,7 @@
           </w:tcPr>
           <w:p>
             <w:r>
-              <w:t>Critical Damage Multiplier</w:t>
+              <w:t>Guard</w:t>
             </w:r>
           </w:p>
         </w:tc>
@@ -4473,13 +4546,7 @@
           </w:tcPr>
           <w:p>
             <w:r>
-              <w:t>C</w:t>
-            </w:r>
-            <w:r>
-              <w:rPr>
-                <w:vertAlign w:val="superscript"/>
-              </w:rPr>
-              <w:t>M</w:t>
+              <w:t>G</w:t>
             </w:r>
           </w:p>
         </w:tc>
@@ -4489,7 +4556,7 @@
           </w:tcPr>
           <w:p>
             <w:r>
-              <w:t>Multiplier applied when a critical hit occurs</w:t>
+              <w:t>Temporary damage-absorption pool</w:t>
             </w:r>
           </w:p>
         </w:tc>
@@ -4504,7 +4571,7 @@
           </w:tcPr>
           <w:p>
             <w:r>
-              <w:t>Guard</w:t>
+              <w:t>Barrier</w:t>
             </w:r>
           </w:p>
         </w:tc>
@@ -4514,7 +4581,7 @@
           </w:tcPr>
           <w:p>
             <w:r>
-              <w:t>G</w:t>
+              <w:t>B</w:t>
             </w:r>
           </w:p>
         </w:tc>
@@ -4524,7 +4591,7 @@
           </w:tcPr>
           <w:p>
             <w:r>
-              <w:t>Temporary damage-absorption pool</w:t>
+              <w:t>Temporary magical shield with a damage-absorption pool</w:t>
             </w:r>
           </w:p>
         </w:tc>
@@ -4536,41 +4603,6 @@
           </w:tcPr>
           <w:p>
             <w:r>
-              <w:t>Barrier</w:t>
-            </w:r>
-          </w:p>
-        </w:tc>
-        <w:tc>
-          <w:tcPr>
-            <w:tcW w:w="1141" w:type="dxa"/>
-          </w:tcPr>
-          <w:p>
-            <w:r>
-              <w:t>B</w:t>
-            </w:r>
-          </w:p>
-        </w:tc>
-        <w:tc>
-          <w:tcPr>
-            <w:tcW w:w="4495" w:type="dxa"/>
-          </w:tcPr>
-          <w:p>
-            <w:r>
-              <w:t>Temporary magical shield with a damage-absorption pool</w:t>
-            </w:r>
-          </w:p>
-        </w:tc>
-      </w:tr>
-      <w:tr>
-        <w:trPr>
-          <w:cnfStyle w:val="000000010000" w:firstRow="0" w:lastRow="0" w:firstColumn="0" w:lastColumn="0" w:oddVBand="0" w:evenVBand="0" w:oddHBand="0" w:evenHBand="1" w:firstRowFirstColumn="0" w:firstRowLastColumn="0" w:lastRowFirstColumn="0" w:lastRowLastColumn="0"/>
-        </w:trPr>
-        <w:tc>
-          <w:tcPr>
-            <w:tcW w:w="3714" w:type="dxa"/>
-          </w:tcPr>
-          <w:p>
-            <w:r>
               <w:t>Mana</w:t>
             </w:r>
           </w:p>
@@ -4597,14 +4629,6 @@
         </w:tc>
       </w:tr>
     </w:tbl>
-    <w:p>
-      <w:pPr>
-        <w:pStyle w:val="Heading3"/>
-      </w:pPr>
-      <w:r>
-        <w:t>Attacking and Defending</w:t>
-      </w:r>
-    </w:p>
     <w:p>
       <w:pPr>
         <w:rPr>
@@ -4614,30 +4638,6 @@
           <w:szCs w:val="28"/>
         </w:rPr>
       </w:pPr>
-      <w:r>
-        <w:t xml:space="preserve">Attacks are determined by </w:t>
-      </w:r>
-      <w:r>
-        <w:t xml:space="preserve">rolling 2 six-sided dice and adding the </w:t>
-      </w:r>
-      <w:r>
-        <w:t xml:space="preserve">attacker’s </w:t>
-      </w:r>
-      <w:r>
-        <w:t>Attack modifier</w:t>
-      </w:r>
-      <w:r>
-        <w:t>.</w:t>
-      </w:r>
-      <w:r>
-        <w:t xml:space="preserve"> </w:t>
-      </w:r>
-      <w:r>
-        <w:t xml:space="preserve">If the </w:t>
-      </w:r>
-      <w:r>
-        <w:t>result is equal to or higher than the defender’s Defense, the attack connects.</w:t>
-      </w:r>
       <w:r>
         <w:br w:type="page"/>
       </w:r>
@@ -4727,28 +4727,35 @@
                 <w:rStyle w:val="Emphasis"/>
                 <w:i/>
               </w:rPr>
-              <w:t>The PC has 10 piercing resistance and 20 fire resistance.</w:t>
+              <w:t xml:space="preserve">Charles </w:t>
             </w:r>
             <w:r>
               <w:rPr>
                 <w:rStyle w:val="Emphasis"/>
                 <w:i/>
               </w:rPr>
-              <w:t xml:space="preserve"> </w:t>
+              <w:t>has 10 piercing resistance and 20 fire resistance.</w:t>
             </w:r>
             <w:r>
               <w:rPr>
                 <w:rStyle w:val="Emphasis"/>
                 <w:i/>
               </w:rPr>
-              <w:t xml:space="preserve">A Syndicate enforcer attacks the </w:t>
+              <w:t xml:space="preserve"> </w:t>
             </w:r>
             <w:r>
               <w:rPr>
                 <w:rStyle w:val="Emphasis"/>
                 <w:i/>
               </w:rPr>
-              <w:t xml:space="preserve">PC </w:t>
+              <w:t xml:space="preserve">A Syndicate enforcer attacks </w:t>
+            </w:r>
+            <w:r>
+              <w:rPr>
+                <w:rStyle w:val="Emphasis"/>
+                <w:i/>
+              </w:rPr>
+              <w:t xml:space="preserve">Charles </w:t>
             </w:r>
             <w:r>
               <w:rPr>
@@ -4917,16 +4924,15 @@
               <w:rPr>
                 <w:rStyle w:val="Emphasis"/>
                 <w:i/>
-                <w:iCs w:val="0"/>
-              </w:rPr>
-              <w:t>T</w:t>
+              </w:rPr>
+              <w:t xml:space="preserve">Charles </w:t>
             </w:r>
             <w:r>
               <w:rPr>
                 <w:rStyle w:val="Emphasis"/>
                 <w:i/>
               </w:rPr>
-              <w:t xml:space="preserve">he PC takes (10 - 1 = </w:t>
+              <w:t xml:space="preserve">takes (10 - 1 = </w:t>
             </w:r>
             <w:r>
               <w:rPr>
@@ -5416,12 +5422,6 @@
       <w:r>
         <w:t>.</w:t>
       </w:r>
-      <w:r>
-        <w:t xml:space="preserve"> There are a few modifications to this roll</w:t>
-      </w:r>
-      <w:r>
-        <w:t>, depending on what the situation calls for.</w:t>
-      </w:r>
     </w:p>
     <w:p>
       <w:pPr>
@@ -5432,19 +5432,28 @@
         </w:numPr>
       </w:pPr>
       <w:r>
-        <w:t xml:space="preserve">Circumstance bonuses </w:t>
+        <w:t>B</w:t>
+      </w:r>
+      <w:r>
+        <w:t xml:space="preserve">onuses </w:t>
       </w:r>
       <w:r>
         <w:t xml:space="preserve">or penalties </w:t>
       </w:r>
       <w:r>
-        <w:t>may be added</w:t>
+        <w:t>are</w:t>
+      </w:r>
+      <w:r>
+        <w:t xml:space="preserve"> added</w:t>
       </w:r>
       <w:r>
         <w:t xml:space="preserve"> alongside the </w:t>
       </w:r>
       <w:r>
         <w:t>Attribute</w:t>
+      </w:r>
+      <w:r>
+        <w:t>.</w:t>
       </w:r>
     </w:p>
     <w:p>
@@ -5459,16 +5468,30 @@
         <w:t xml:space="preserve">Rolling with </w:t>
       </w:r>
       <w:r>
+        <w:rPr>
+          <w:i/>
+          <w:iCs/>
+        </w:rPr>
         <w:t>a</w:t>
       </w:r>
       <w:r>
-        <w:t xml:space="preserve">dvantage </w:t>
+        <w:rPr>
+          <w:i/>
+          <w:iCs/>
+        </w:rPr>
+        <w:t>dvantage</w:t>
+      </w:r>
+      <w:r>
+        <w:t xml:space="preserve"> </w:t>
       </w:r>
       <w:r>
         <w:t xml:space="preserve">means one of the two six-sided dice is rolled twice, with the higher number being </w:t>
       </w:r>
       <w:r>
         <w:t>chosen</w:t>
+      </w:r>
+      <w:r>
+        <w:t>.</w:t>
       </w:r>
     </w:p>
     <w:p>
@@ -5480,31 +5503,50 @@
         </w:numPr>
       </w:pPr>
       <w:r>
-        <w:t xml:space="preserve">Rolling with disadvantage </w:t>
-      </w:r>
-      <w:r>
-        <w:t>means one of the two six-sided dice is rolled twice, with the lower number being chosen</w:t>
-      </w:r>
-    </w:p>
-    <w:p>
-      <w:r>
-        <w:t xml:space="preserve">The degree of success of a challenge roll is determined by comparing the result of the roll with </w:t>
-      </w:r>
-      <w:r>
-        <w:t xml:space="preserve">a </w:t>
+        <w:t xml:space="preserve">Rolling with </w:t>
       </w:r>
       <w:r>
         <w:rPr>
           <w:i/>
           <w:iCs/>
         </w:rPr>
+        <w:t>disadvantage</w:t>
+      </w:r>
+      <w:r>
+        <w:t xml:space="preserve"> </w:t>
+      </w:r>
+      <w:r>
+        <w:t>means one of the two six-sided dice is rolled twice, with the lower number being chosen</w:t>
+      </w:r>
+      <w:r>
+        <w:t>.</w:t>
+      </w:r>
+    </w:p>
+    <w:p>
+      <w:r>
+        <w:t xml:space="preserve">The degree of success of a challenge roll is determined by comparing the result of the roll with </w:t>
+      </w:r>
+      <w:r>
+        <w:t xml:space="preserve">a </w:t>
+      </w:r>
+      <w:r>
+        <w:rPr>
+          <w:i/>
+          <w:iCs/>
+        </w:rPr>
         <w:t>target number</w:t>
       </w:r>
       <w:r>
         <w:t>.</w:t>
       </w:r>
       <w:r>
-        <w:t xml:space="preserve"> The target number is provided at the start of the roll by the target of the roll, or the challenge being attempted.</w:t>
+        <w:t xml:space="preserve"> The target number is provided at the start of the roll by the target of the roll, or </w:t>
+      </w:r>
+      <w:r>
+        <w:t xml:space="preserve">by </w:t>
+      </w:r>
+      <w:r>
+        <w:t>the challenge being attempted.</w:t>
       </w:r>
     </w:p>
     <w:tbl>
@@ -5742,11 +5784,7 @@
         </w:tc>
       </w:tr>
     </w:tbl>
-    <w:p>
-      <w:pPr>
-        <w:pStyle w:val="Heading3"/>
-      </w:pPr>
-    </w:p>
+    <w:p/>
     <w:p>
       <w:pPr>
         <w:rPr>
@@ -6842,30 +6880,6 @@
     </w:p>
     <w:p>
       <w:pPr>
-        <w:sectPr>
-          <w:type w:val="continuous"/>
-          <w:pgSz w:w="12240" w:h="15840"/>
-          <w:pgMar w:top="1440" w:right="1440" w:bottom="1440" w:left="1440" w:header="720" w:footer="720" w:gutter="0"/>
-          <w:cols w:space="720"/>
-          <w:docGrid w:linePitch="360"/>
-        </w:sectPr>
-      </w:pPr>
-    </w:p>
-    <w:p>
-      <w:pPr>
-        <w:rPr>
-          <w:rFonts w:eastAsiaTheme="majorEastAsia" w:cstheme="majorBidi"/>
-          <w:color w:val="0F4761" w:themeColor="accent1" w:themeShade="BF"/>
-          <w:sz w:val="32"/>
-          <w:szCs w:val="32"/>
-        </w:rPr>
-      </w:pPr>
-      <w:r>
-        <w:br w:type="page"/>
-      </w:r>
-    </w:p>
-    <w:p>
-      <w:pPr>
         <w:pStyle w:val="Heading2"/>
       </w:pPr>
       <w:r>
@@ -10253,6 +10267,17 @@
       </w:r>
     </w:p>
     <w:p>
+      <w:pPr>
+        <w:sectPr>
+          <w:type w:val="continuous"/>
+          <w:pgSz w:w="12240" w:h="15840"/>
+          <w:pgMar w:top="1440" w:right="1440" w:bottom="1440" w:left="1440" w:header="720" w:footer="720" w:gutter="0"/>
+          <w:cols w:sep="1" w:space="0"/>
+          <w:docGrid w:linePitch="360"/>
+        </w:sectPr>
+      </w:pPr>
+    </w:p>
+    <w:p>
       <w:r>
         <w:t>The rules need to stay relatively simple and straightforward.</w:t>
       </w:r>
@@ -10335,153 +10360,407 @@
         <w:t>Star Wars: Galaxy of Heroes</w:t>
       </w:r>
       <w:r>
-        <w:t>.</w:t>
-      </w:r>
-    </w:p>
-    <w:p>
-      <w:r>
-        <w:t xml:space="preserve">On each character’s turn, </w:t>
-      </w:r>
-      <w:r>
-        <w:t xml:space="preserve">they get to spend </w:t>
-      </w:r>
-      <w:r>
-        <w:t>three Actions</w:t>
-      </w:r>
-      <w:r>
-        <w:t xml:space="preserve"> (or less). </w:t>
-      </w:r>
-      <w:r>
-        <w:t xml:space="preserve">An ability may have some number of Actions as its cost, as well as a cooldown, </w:t>
-      </w:r>
-      <w:r>
-        <w:t>M</w:t>
-      </w:r>
-      <w:r>
-        <w:t>ana</w:t>
-      </w:r>
-      <w:r>
-        <w:t xml:space="preserve">, or Health in some cases. </w:t>
-      </w:r>
-      <w:r>
-        <w:t>This is heavily inspired by Pathfinder.</w:t>
-      </w:r>
-    </w:p>
-    <w:p>
-      <w:r>
-        <w:t xml:space="preserve">The regular Strike action that every character has access to costs one Action and has zero cooldown. However, it also applies </w:t>
-      </w:r>
-      <w:r>
-        <w:t xml:space="preserve">the </w:t>
-      </w:r>
-      <w:r>
         <w:rPr>
           <w:i/>
           <w:iCs/>
         </w:rPr>
-        <w:t>Strain</w:t>
-      </w:r>
-      <w:r>
-        <w:t xml:space="preserve"> Effect.</w:t>
-      </w:r>
-    </w:p>
-    <w:p>
-      <w:pPr>
-        <w:pStyle w:val="Heading2"/>
-      </w:pPr>
-      <w:r>
-        <w:t>Conditions</w:t>
-      </w:r>
-    </w:p>
-    <w:p>
-      <w:r>
-        <w:t xml:space="preserve">Conditions are </w:t>
-      </w:r>
-      <w:r>
-        <w:t xml:space="preserve">common </w:t>
-      </w:r>
-      <w:r>
-        <w:t>Effects applied during combat.</w:t>
-      </w:r>
-    </w:p>
-    <w:p>
-      <w:r>
-        <w:rPr>
-          <w:u w:val="single"/>
-        </w:rPr>
-        <w:t>Winded</w:t>
-      </w:r>
-      <w:r>
-        <w:t xml:space="preserve">: You’re out of </w:t>
-      </w:r>
-      <w:r>
-        <w:t>breath and</w:t>
-      </w:r>
-      <w:r>
-        <w:t xml:space="preserve"> will take a -2 penalty to your Attack until your next turn begins. This Effect stacks.</w:t>
-      </w:r>
-    </w:p>
-    <w:p>
-      <w:r>
-        <w:rPr>
-          <w:u w:val="single"/>
-        </w:rPr>
-        <w:t>Off Guard</w:t>
-      </w:r>
-      <w:r>
-        <w:t>: You are distracted from your defense.</w:t>
+        <w:t>.</w:t>
+      </w:r>
+    </w:p>
+    <w:p>
+      <w:r>
+        <w:t xml:space="preserve">On each character’s turn, </w:t>
+      </w:r>
+      <w:r>
+        <w:t xml:space="preserve">they </w:t>
+      </w:r>
+      <w:r>
+        <w:t xml:space="preserve">gain </w:t>
+      </w:r>
+      <w:r>
+        <w:t>up to three</w:t>
+      </w:r>
+      <w:r>
+        <w:t xml:space="preserve"> Actions</w:t>
+      </w:r>
+      <w:r>
+        <w:t xml:space="preserve"> that can be spent on </w:t>
+      </w:r>
+      <w:r>
+        <w:t>a</w:t>
+      </w:r>
+      <w:r>
+        <w:t>bilities</w:t>
+      </w:r>
+      <w:r>
+        <w:t xml:space="preserve">. </w:t>
+      </w:r>
+      <w:r>
+        <w:t xml:space="preserve">An ability </w:t>
+      </w:r>
+      <w:r>
+        <w:t>will</w:t>
+      </w:r>
+      <w:r>
+        <w:t xml:space="preserve"> have some number of Actions as its cost, as well as a cooldown, </w:t>
+      </w:r>
+      <w:r>
+        <w:t>M</w:t>
+      </w:r>
+      <w:r>
+        <w:t>ana</w:t>
+      </w:r>
+      <w:r>
+        <w:t xml:space="preserve">, or Health in some cases. </w:t>
+      </w:r>
+      <w:r>
+        <w:t>This is heavily inspired by Pathfinder.</w:t>
       </w:r>
       <w:r>
         <w:t xml:space="preserve"> </w:t>
       </w:r>
-      <w:r>
-        <w:t xml:space="preserve">You get </w:t>
-      </w:r>
-      <w:r>
-        <w:t>-2 Defense</w:t>
-      </w:r>
-      <w:r>
-        <w:t xml:space="preserve"> </w:t>
-      </w:r>
-      <w:r>
-        <w:t>when attacked</w:t>
-      </w:r>
-      <w:r>
-        <w:t>.</w:t>
-      </w:r>
-      <w:r>
-        <w:t xml:space="preserve"> Does not stack.</w:t>
-      </w:r>
-    </w:p>
-    <w:p>
-      <w:pPr>
-        <w:rPr>
-          <w:rFonts w:ascii="Cambria Math" w:hAnsi="Cambria Math" w:cs="Cambria Math"/>
-        </w:rPr>
-      </w:pPr>
-      <w:r>
-        <w:rPr>
-          <w:u w:val="single"/>
-        </w:rPr>
-        <w:t>Threatened</w:t>
-      </w:r>
-      <w:r>
-        <w:t xml:space="preserve">: </w:t>
-      </w:r>
-      <w:r>
-        <w:t xml:space="preserve">You </w:t>
-      </w:r>
-      <w:r>
-        <w:t xml:space="preserve">are threatened by a particular individual on the battlefield. If you attack anyone besides this individual for the duration, you will become </w:t>
+    </w:p>
+    <w:p>
+      <w:r>
+        <w:t xml:space="preserve">The regular Strike action that every character has access to costs one Action and has zero cooldown. However, it also applies </w:t>
+      </w:r>
+      <w:r>
+        <w:t xml:space="preserve">the </w:t>
       </w:r>
       <w:r>
         <w:rPr>
           <w:i/>
           <w:iCs/>
         </w:rPr>
+        <w:t>Winded</w:t>
+      </w:r>
+      <w:r>
+        <w:t xml:space="preserve"> Effect</w:t>
+      </w:r>
+      <w:r>
+        <w:t xml:space="preserve"> (</w:t>
+      </w:r>
+      <w:r>
+        <w:t xml:space="preserve">essentially the </w:t>
+      </w:r>
+      <w:r>
+        <w:t>Multiple Action Penalty from Pathfinder).</w:t>
+      </w:r>
+      <w:r>
+        <w:t xml:space="preserve"> This is to discourage players from just striking</w:t>
+      </w:r>
+      <w:r>
+        <w:t xml:space="preserve"> repeatedly</w:t>
+      </w:r>
+      <w:r>
+        <w:t>, and instead to use their different abilities.</w:t>
+      </w:r>
+    </w:p>
+    <w:p>
+      <w:pPr>
+        <w:pStyle w:val="Heading2"/>
+        <w:sectPr>
+          <w:type w:val="continuous"/>
+          <w:pgSz w:w="12240" w:h="15840"/>
+          <w:pgMar w:top="1440" w:right="1440" w:bottom="1440" w:left="1440" w:header="720" w:footer="720" w:gutter="0"/>
+          <w:cols w:num="2" w:space="288"/>
+          <w:docGrid w:linePitch="360"/>
+        </w:sectPr>
+      </w:pPr>
+    </w:p>
+    <w:p>
+      <w:pPr>
+        <w:pStyle w:val="Heading2"/>
+      </w:pPr>
+      <w:r>
+        <w:t>Basic Abilities</w:t>
+      </w:r>
+    </w:p>
+    <w:p>
+      <w:r>
+        <w:t>Basic Abilities are Abilities that any character can perform.</w:t>
+      </w:r>
+    </w:p>
+    <w:p>
+      <w:r>
+        <w:rPr>
+          <w:u w:val="single"/>
+        </w:rPr>
+        <w:t xml:space="preserve">Melee </w:t>
+      </w:r>
+      <w:r>
+        <w:rPr>
+          <w:u w:val="single"/>
+        </w:rPr>
+        <w:t xml:space="preserve">Strike </w:t>
+      </w:r>
+      <w:r>
+        <w:rPr>
+          <w:u w:val="single"/>
+        </w:rPr>
+        <w:t xml:space="preserve">or </w:t>
+      </w:r>
+      <w:r>
+        <w:rPr>
+          <w:u w:val="single"/>
+        </w:rPr>
+        <w:t>Ranged</w:t>
+      </w:r>
+      <w:r>
+        <w:rPr>
+          <w:u w:val="single"/>
+        </w:rPr>
+        <w:t xml:space="preserve"> Strike</w:t>
+      </w:r>
+      <w:r>
+        <w:t xml:space="preserve">: </w:t>
+      </w:r>
+      <w:r>
+        <w:t xml:space="preserve">Challenge </w:t>
+      </w:r>
+      <w:r>
+        <w:t>Roll Attack vs the target's Defense</w:t>
+      </w:r>
+      <w:r>
+        <w:t xml:space="preserve">, then apply </w:t>
+      </w:r>
+      <w:r>
+        <w:t xml:space="preserve">an instant effect for the </w:t>
+      </w:r>
+      <w:r>
+        <w:t xml:space="preserve">weapon </w:t>
+      </w:r>
+      <w:r>
+        <w:t>damage (with modifiers if relevant)</w:t>
+      </w:r>
+      <w:r>
+        <w:t>.</w:t>
+      </w:r>
+    </w:p>
+    <w:p>
+      <w:pPr>
+        <w:pStyle w:val="ListParagraph"/>
+        <w:numPr>
+          <w:ilvl w:val="0"/>
+          <w:numId w:val="40"/>
+        </w:numPr>
+      </w:pPr>
+      <w:r>
+        <w:t xml:space="preserve">Melee Weapon: </w:t>
+      </w:r>
+      <w:r>
+        <w:t>Brawn + Melee Accuracy</w:t>
+      </w:r>
+    </w:p>
+    <w:p>
+      <w:pPr>
+        <w:pStyle w:val="ListParagraph"/>
+        <w:numPr>
+          <w:ilvl w:val="0"/>
+          <w:numId w:val="39"/>
+        </w:numPr>
+      </w:pPr>
+      <w:r>
+        <w:t>Ranged Weapon: Agility + Ranged Accuracy</w:t>
+      </w:r>
+      <w:r>
+        <w:br w:type="page"/>
+      </w:r>
+    </w:p>
+    <w:p>
+      <w:pPr>
+        <w:pStyle w:val="Heading2"/>
+      </w:pPr>
+      <w:r>
+        <w:lastRenderedPageBreak/>
+        <w:t>Effects</w:t>
+      </w:r>
+    </w:p>
+    <w:p>
+      <w:pPr>
+        <w:sectPr>
+          <w:type w:val="continuous"/>
+          <w:pgSz w:w="12240" w:h="15840"/>
+          <w:pgMar w:top="1440" w:right="1440" w:bottom="1440" w:left="1440" w:header="720" w:footer="720" w:gutter="0"/>
+          <w:cols w:sep="1" w:space="0"/>
+          <w:docGrid w:linePitch="360"/>
+        </w:sectPr>
+      </w:pPr>
+    </w:p>
+    <w:p>
+      <w:r>
+        <w:t>Effects</w:t>
+      </w:r>
+      <w:r>
+        <w:t xml:space="preserve"> are conditions</w:t>
+      </w:r>
+      <w:r>
+        <w:t xml:space="preserve"> applied </w:t>
+      </w:r>
+      <w:r>
+        <w:t xml:space="preserve">to a character </w:t>
+      </w:r>
+      <w:r>
+        <w:t>during combat.</w:t>
+      </w:r>
+    </w:p>
+    <w:p>
+      <w:r>
+        <w:t>A</w:t>
+      </w:r>
+      <w:r>
+        <w:t xml:space="preserve">n Effect modifies some aspect of the character's stats or behavior, and </w:t>
+      </w:r>
+      <w:r>
+        <w:t>typically lasts for one turn</w:t>
+      </w:r>
+      <w:r>
+        <w:t xml:space="preserve">. </w:t>
+      </w:r>
+    </w:p>
+    <w:p>
+      <w:r>
+        <w:t>U</w:t>
+      </w:r>
+      <w:r>
+        <w:t xml:space="preserve">nless otherwise specified, </w:t>
+      </w:r>
+      <w:r>
+        <w:t xml:space="preserve">Effects </w:t>
+      </w:r>
+      <w:r>
+        <w:t>will stack by lasting additional turns.</w:t>
+      </w:r>
+      <w:r>
+        <w:t xml:space="preserve"> </w:t>
+      </w:r>
+    </w:p>
+    <w:p>
+      <w:r>
+        <w:t>Effects will typically lose one stack per turn.</w:t>
+      </w:r>
+    </w:p>
+    <w:p>
+      <w:pPr>
+        <w:sectPr>
+          <w:type w:val="continuous"/>
+          <w:pgSz w:w="12240" w:h="15840"/>
+          <w:pgMar w:top="1440" w:right="1440" w:bottom="1440" w:left="1440" w:header="720" w:footer="720" w:gutter="0"/>
+          <w:cols w:num="2" w:space="288"/>
+          <w:docGrid w:linePitch="360"/>
+        </w:sectPr>
+      </w:pPr>
+      <w:r>
+        <w:t xml:space="preserve">Effects contain information relevant to the modifications to behavior or stats they make, and also a reference to the origin of the Effect (the </w:t>
+      </w:r>
+      <w:r>
+        <w:t>Action</w:t>
+      </w:r>
+      <w:r>
+        <w:t xml:space="preserve"> that caused it, </w:t>
+      </w:r>
+      <w:r>
+        <w:t xml:space="preserve">and </w:t>
+      </w:r>
+      <w:r>
+        <w:t xml:space="preserve">by that way, </w:t>
+      </w:r>
+      <w:r>
+        <w:t xml:space="preserve">the </w:t>
+      </w:r>
+      <w:r>
+        <w:t>A</w:t>
+      </w:r>
+      <w:r>
+        <w:t>ctor who caused the action)</w:t>
+      </w:r>
+      <w:r>
+        <w:t>.</w:t>
+      </w:r>
+    </w:p>
+    <w:p>
+      <w:r>
+        <w:rPr>
+          <w:u w:val="single"/>
+        </w:rPr>
+        <w:t>Winded</w:t>
+      </w:r>
+      <w:r>
+        <w:t xml:space="preserve">: You’re out of </w:t>
+      </w:r>
+      <w:r>
+        <w:t>breath and</w:t>
+      </w:r>
+      <w:r>
+        <w:t xml:space="preserve"> will take a -2 penalty to your Attack.</w:t>
+      </w:r>
+      <w:r>
+        <w:t xml:space="preserve"> This effect will always be dispelled at the</w:t>
+      </w:r>
+      <w:r>
+        <w:t xml:space="preserve"> end of your turn.</w:t>
+      </w:r>
+    </w:p>
+    <w:p>
+      <w:r>
+        <w:rPr>
+          <w:u w:val="single"/>
+        </w:rPr>
         <w:t>Off Guard</w:t>
       </w:r>
       <w:r>
+        <w:t>: You are distracted from your defense.</w:t>
+      </w:r>
+      <w:r>
+        <w:t xml:space="preserve"> </w:t>
+      </w:r>
+      <w:r>
+        <w:t xml:space="preserve">You get </w:t>
+      </w:r>
+      <w:r>
+        <w:t>-2 Defense</w:t>
+      </w:r>
+      <w:r>
+        <w:t xml:space="preserve"> </w:t>
+      </w:r>
+      <w:r>
+        <w:t>when attacked</w:t>
+      </w:r>
+      <w:r>
+        <w:t>.</w:t>
+      </w:r>
+      <w:r>
+        <w:t xml:space="preserve"> Does not stack.</w:t>
+      </w:r>
+    </w:p>
+    <w:p>
+      <w:pPr>
+        <w:rPr>
+          <w:rFonts w:ascii="Cambria Math" w:hAnsi="Cambria Math" w:cs="Cambria Math"/>
+        </w:rPr>
+      </w:pPr>
+      <w:r>
+        <w:rPr>
+          <w:u w:val="single"/>
+        </w:rPr>
+        <w:t>Threatened</w:t>
+      </w:r>
+      <w:r>
+        <w:t xml:space="preserve">: </w:t>
+      </w:r>
+      <w:r>
+        <w:t xml:space="preserve">You </w:t>
+      </w:r>
+      <w:r>
+        <w:t xml:space="preserve">are threatened by a particular individual on the battlefield. If you attack anyone besides this individual for the duration, you will become </w:t>
+      </w:r>
+      <w:r>
+        <w:rPr>
+          <w:rStyle w:val="EffectChar"/>
+        </w:rPr>
+        <w:t>Off Guard</w:t>
+      </w:r>
+      <w:r>
         <w:t xml:space="preserve"> for 1</w:t>
       </w:r>
       <w:r>
@@ -10514,60 +10793,927 @@
         <w:t xml:space="preserve">You cannot act. </w:t>
       </w:r>
       <w:r>
+        <w:t xml:space="preserve">You gain Actions at the start of your next turn but </w:t>
+      </w:r>
+      <w:r>
+        <w:t xml:space="preserve">cannot </w:t>
+      </w:r>
+      <w:r>
+        <w:t xml:space="preserve">act or </w:t>
+      </w:r>
+      <w:r>
+        <w:t>react</w:t>
+      </w:r>
+      <w:r>
+        <w:t xml:space="preserve"> until you lose this condition</w:t>
+      </w:r>
+      <w:r>
+        <w:t xml:space="preserve">. </w:t>
+      </w:r>
+      <w:r>
         <w:t xml:space="preserve">You are automatically </w:t>
+      </w:r>
+      <w:r>
+        <w:rPr>
+          <w:rStyle w:val="EffectChar"/>
+        </w:rPr>
+        <w:t>Off Guard</w:t>
+      </w:r>
+      <w:r>
+        <w:t>.</w:t>
+      </w:r>
+      <w:r>
+        <w:t xml:space="preserve"> Does not stack.</w:t>
+      </w:r>
+    </w:p>
+    <w:p>
+      <w:r>
+        <w:rPr>
+          <w:u w:val="single"/>
+        </w:rPr>
+        <w:t>Slowed</w:t>
+      </w:r>
+      <w:r>
+        <w:t xml:space="preserve">: You </w:t>
+      </w:r>
+      <w:r>
+        <w:t xml:space="preserve">gain one less </w:t>
+      </w:r>
+      <w:r>
+        <w:t xml:space="preserve">Action </w:t>
+      </w:r>
+      <w:r>
+        <w:t xml:space="preserve">at the start of </w:t>
+      </w:r>
+      <w:r>
+        <w:t>your next turn.</w:t>
+      </w:r>
+      <w:r>
+        <w:t xml:space="preserve"> If this stacks, you lose additional action</w:t>
+      </w:r>
+      <w:r>
+        <w:t>s</w:t>
+      </w:r>
+      <w:r>
+        <w:t xml:space="preserve"> (</w:t>
+      </w:r>
+      <w:r>
+        <w:t xml:space="preserve">potentially </w:t>
+      </w:r>
+      <w:r>
+        <w:t>lasting into future turns)</w:t>
+      </w:r>
+      <w:r>
+        <w:t>.</w:t>
+      </w:r>
+    </w:p>
+    <w:p>
+      <w:r>
+        <w:rPr>
+          <w:u w:val="single"/>
+        </w:rPr>
+        <w:t>Immobilized</w:t>
+      </w:r>
+      <w:r>
+        <w:t>: You cannot move to make melee attacks.</w:t>
+      </w:r>
+    </w:p>
+    <w:p>
+      <w:r>
+        <w:rPr>
+          <w:u w:val="single"/>
+        </w:rPr>
+        <w:t>Steady</w:t>
+      </w:r>
+      <w:r>
+        <w:t>: +10% physical damage until your next attack</w:t>
+      </w:r>
+      <w:r>
+        <w:t>.</w:t>
+      </w:r>
+    </w:p>
+    <w:p>
+      <w:r>
+        <w:rPr>
+          <w:u w:val="single"/>
+        </w:rPr>
+        <w:t>Focused</w:t>
+      </w:r>
+      <w:r>
+        <w:t>: Recover Mana equal to 5</w:t>
+      </w:r>
+      <w:r>
+        <w:t xml:space="preserve"> </w:t>
+      </w:r>
+      <w:r>
+        <w:t xml:space="preserve">+ </w:t>
+      </w:r>
+      <w:r>
+        <w:t>(</w:t>
+      </w:r>
+      <w:r>
+        <w:t xml:space="preserve">the Effect's actor's Aura </w:t>
+      </w:r>
+      <w:r>
+        <w:rPr>
+          <w:b/>
+          <w:bCs/>
+        </w:rPr>
+        <w:t>×</w:t>
+      </w:r>
+      <w:r>
+        <w:t xml:space="preserve"> 5</w:t>
+      </w:r>
+      <w:r>
+        <w:t>)</w:t>
+      </w:r>
+      <w:r>
+        <w:t>.</w:t>
+      </w:r>
+    </w:p>
+    <w:p>
+      <w:r>
+        <w:rPr>
+          <w:u w:val="single"/>
+        </w:rPr>
+        <w:t>Protected</w:t>
+      </w:r>
+      <w:r>
+        <w:t xml:space="preserve">: </w:t>
+      </w:r>
+      <w:r>
+        <w:t>W</w:t>
+      </w:r>
+      <w:r>
+        <w:t xml:space="preserve">hen </w:t>
+      </w:r>
+      <w:r>
+        <w:t xml:space="preserve">you </w:t>
+      </w:r>
+      <w:r>
+        <w:t xml:space="preserve">are attacked, </w:t>
+      </w:r>
+      <w:r>
+        <w:t xml:space="preserve">the Effect's actor </w:t>
+      </w:r>
+      <w:r>
+        <w:t>take</w:t>
+      </w:r>
+      <w:r>
+        <w:t>s</w:t>
+      </w:r>
+      <w:r>
+        <w:t xml:space="preserve"> the damage instead.</w:t>
+      </w:r>
+    </w:p>
+    <w:p>
+      <w:pPr>
+        <w:rPr>
+          <w:rFonts w:eastAsiaTheme="majorEastAsia" w:cstheme="majorBidi"/>
+          <w:color w:val="0F4761" w:themeColor="accent1" w:themeShade="BF"/>
+          <w:sz w:val="32"/>
+          <w:szCs w:val="32"/>
+        </w:rPr>
+      </w:pPr>
+      <w:r>
+        <w:br w:type="page"/>
+      </w:r>
+    </w:p>
+    <w:p>
+      <w:pPr>
+        <w:pStyle w:val="Heading2"/>
+      </w:pPr>
+      <w:r>
+        <w:lastRenderedPageBreak/>
+        <w:t>Weapon Damage</w:t>
+      </w:r>
+    </w:p>
+    <w:p>
+      <w:pPr>
+        <w:sectPr>
+          <w:type w:val="continuous"/>
+          <w:pgSz w:w="12240" w:h="15840"/>
+          <w:pgMar w:top="1440" w:right="1440" w:bottom="1440" w:left="1440" w:header="720" w:footer="720" w:gutter="0"/>
+          <w:cols w:sep="1" w:space="0"/>
+          <w:docGrid w:linePitch="360"/>
+        </w:sectPr>
+      </w:pPr>
+    </w:p>
+    <w:p>
+      <w:r>
+        <w:t>Damage is primarily weapon-driven (except for spells). All modifiers to characters happen through Effects, and weapon damage is no exception.</w:t>
+      </w:r>
+    </w:p>
+    <w:p>
+      <w:r>
+        <w:t xml:space="preserve">It's applied as an </w:t>
       </w:r>
       <w:r>
         <w:rPr>
           <w:i/>
           <w:iCs/>
         </w:rPr>
-        <w:t>Off Guard</w:t>
+        <w:t>Instant Effect</w:t>
+      </w:r>
+      <w:r>
+        <w:t>, which is hidden from the player's view.</w:t>
+      </w:r>
+    </w:p>
+    <w:p>
+      <w:r>
+        <w:t>The label is something like "Taking damage</w:t>
+      </w:r>
+      <w:r>
+        <w:t>".</w:t>
+      </w:r>
+    </w:p>
+    <w:p>
+      <w:pPr>
+        <w:sectPr>
+          <w:type w:val="continuous"/>
+          <w:pgSz w:w="12240" w:h="15840"/>
+          <w:pgMar w:top="1440" w:right="1440" w:bottom="1440" w:left="1440" w:header="720" w:footer="720" w:gutter="0"/>
+          <w:cols w:num="2" w:space="288"/>
+          <w:docGrid w:linePitch="360"/>
+        </w:sectPr>
+      </w:pPr>
+      <w:r>
+        <w:t>T</w:t>
+      </w:r>
+      <w:r>
+        <w:t xml:space="preserve">he formula </w:t>
+      </w:r>
+      <w:r>
+        <w:t xml:space="preserve">for damage </w:t>
+      </w:r>
+      <w:r>
+        <w:t>is contained within the Effect like all other Effects.</w:t>
+      </w:r>
+    </w:p>
+    <w:p>
+      <w:pPr>
+        <w:pStyle w:val="Heading2"/>
+      </w:pPr>
+      <w:r>
+        <w:t>Actor/</w:t>
+      </w:r>
+      <w:r>
+        <w:t>Action</w:t>
+      </w:r>
+      <w:r>
+        <w:t>/</w:t>
+      </w:r>
+      <w:r>
+        <w:t xml:space="preserve">Effect </w:t>
+      </w:r>
+      <w:r>
+        <w:t>Syste</w:t>
+      </w:r>
+      <w:r>
+        <w:t>m</w:t>
+      </w:r>
+    </w:p>
+    <w:p>
+      <w:r>
+        <w:t xml:space="preserve">Scenario: </w:t>
+      </w:r>
+      <w:r>
+        <w:t>Char A</w:t>
+      </w:r>
+      <w:r>
+        <w:t xml:space="preserve"> ("Andrew")</w:t>
+      </w:r>
+      <w:r>
+        <w:t>. attacks Char B</w:t>
+      </w:r>
+      <w:r>
+        <w:t xml:space="preserve"> ("Beth")</w:t>
+      </w:r>
+      <w:r>
+        <w:t xml:space="preserve"> with a melee Strike</w:t>
+      </w:r>
+      <w:r>
+        <w:t>, hits, and</w:t>
+      </w:r>
+      <w:r>
+        <w:t xml:space="preserve"> </w:t>
+      </w:r>
+      <w:r>
+        <w:t>Beth</w:t>
+      </w:r>
+      <w:r>
+        <w:t xml:space="preserve"> takes </w:t>
+      </w:r>
+      <w:r>
+        <w:t>12 damage.</w:t>
+      </w:r>
+    </w:p>
+    <w:p>
+      <w:r>
+        <w:t xml:space="preserve">It's important to use language like "X attacks Y and Y takes 12 damage" instead of saying "X deals 12 damage to Y" to keep things clear, because technically in this situation Beth would be the one applying damage to herself, rather than being acted upon. </w:t>
+      </w:r>
+    </w:p>
+    <w:p>
+      <w:pPr>
+        <w:pStyle w:val="ListParagraph"/>
+        <w:numPr>
+          <w:ilvl w:val="0"/>
+          <w:numId w:val="26"/>
+        </w:numPr>
+      </w:pPr>
+      <w:r>
+        <w:rPr>
+          <w:b/>
+          <w:bCs/>
+        </w:rPr>
+        <w:t>Decision Making Phase</w:t>
+      </w:r>
+      <w:r>
+        <w:t xml:space="preserve">: </w:t>
+      </w:r>
+      <w:r>
+        <w:t>Andrew</w:t>
+      </w:r>
+      <w:r>
+        <w:t xml:space="preserve"> </w:t>
+      </w:r>
+      <w:r>
+        <w:t xml:space="preserve">chooses the </w:t>
+      </w:r>
+      <w:r>
+        <w:rPr>
+          <w:i/>
+          <w:iCs/>
+        </w:rPr>
+        <w:t>Melee Strike</w:t>
+      </w:r>
+      <w:r>
+        <w:t xml:space="preserve"> Ability</w:t>
+      </w:r>
+      <w:r>
+        <w:t xml:space="preserve"> and targets Beth</w:t>
       </w:r>
       <w:r>
         <w:t>.</w:t>
       </w:r>
-      <w:r>
-        <w:t xml:space="preserve"> If this stacks, you are incapacitated for additional turn</w:t>
-      </w:r>
+    </w:p>
+    <w:p>
+      <w:pPr>
+        <w:pStyle w:val="ListParagraph"/>
+        <w:numPr>
+          <w:ilvl w:val="0"/>
+          <w:numId w:val="26"/>
+        </w:numPr>
+      </w:pPr>
+      <w:r>
+        <w:rPr>
+          <w:b/>
+          <w:bCs/>
+        </w:rPr>
+        <w:t>Action Generation Phase</w:t>
+      </w:r>
+      <w:r>
+        <w:t xml:space="preserve">: </w:t>
+      </w:r>
+      <w:r>
+        <w:t xml:space="preserve">Andrew </w:t>
+      </w:r>
+      <w:r>
+        <w:t>creates a</w:t>
+      </w:r>
+      <w:r>
+        <w:t xml:space="preserve"> </w:t>
+      </w:r>
+      <w:r>
+        <w:rPr>
+          <w:rStyle w:val="CodeChar"/>
+        </w:rPr>
+        <w:t>CombatAction</w:t>
+      </w:r>
+      <w:r>
+        <w:t xml:space="preserve"> object</w:t>
+      </w:r>
+      <w:r>
+        <w:t xml:space="preserve"> </w:t>
+      </w:r>
+      <w:r>
+        <w:t xml:space="preserve">and </w:t>
+      </w:r>
+      <w:r>
+        <w:t xml:space="preserve">populates it </w:t>
+      </w:r>
+      <w:r>
+        <w:t xml:space="preserve">with </w:t>
+      </w:r>
+      <w:r>
+        <w:t>"</w:t>
+      </w:r>
+      <w:r>
+        <w:t>MeleeStrike</w:t>
+      </w:r>
+      <w:r>
+        <w:t xml:space="preserve">" </w:t>
+      </w:r>
+      <w:r>
+        <w:t xml:space="preserve">data from </w:t>
+      </w:r>
+      <w:r>
+        <w:t xml:space="preserve">the </w:t>
+      </w:r>
+      <w:r>
+        <w:t>action library</w:t>
+      </w:r>
+      <w:r>
+        <w:t>.</w:t>
+      </w:r>
+    </w:p>
+    <w:p>
+      <w:pPr>
+        <w:pStyle w:val="ListParagraph"/>
+        <w:numPr>
+          <w:ilvl w:val="0"/>
+          <w:numId w:val="26"/>
+        </w:numPr>
+      </w:pPr>
+      <w:r>
+        <w:rPr>
+          <w:b/>
+          <w:bCs/>
+        </w:rPr>
+        <w:t>Execution Phase</w:t>
+      </w:r>
+      <w:r>
+        <w:t xml:space="preserve">: </w:t>
+      </w:r>
+    </w:p>
+    <w:p>
+      <w:pPr>
+        <w:rPr>
+          <w:u w:val="single"/>
+        </w:rPr>
+      </w:pPr>
+      <w:r>
+        <w:rPr>
+          <w:u w:val="single"/>
+        </w:rPr>
+        <w:br w:type="page"/>
+      </w:r>
+    </w:p>
+    <w:p>
+      <w:pPr>
+        <w:rPr>
+          <w:u w:val="single"/>
+        </w:rPr>
+      </w:pPr>
+      <w:r>
+        <w:rPr>
+          <w:u w:val="single"/>
+        </w:rPr>
+        <w:lastRenderedPageBreak/>
+        <w:t>Combat</w:t>
+      </w:r>
+      <w:r>
+        <w:rPr>
+          <w:u w:val="single"/>
+        </w:rPr>
+        <w:t>Action</w:t>
+      </w:r>
+    </w:p>
+    <w:p>
+      <w:pPr>
+        <w:pStyle w:val="ListParagraph"/>
+        <w:numPr>
+          <w:ilvl w:val="0"/>
+          <w:numId w:val="39"/>
+        </w:numPr>
+      </w:pPr>
+      <w:r>
+        <w:t>i</w:t>
+      </w:r>
+      <w:r>
+        <w:t>d</w:t>
+      </w:r>
+      <w:r>
+        <w:t xml:space="preserve">: A unique id for this </w:t>
+      </w:r>
+      <w:r>
+        <w:t>Action</w:t>
+      </w:r>
+    </w:p>
+    <w:p>
+      <w:pPr>
+        <w:pStyle w:val="ListParagraph"/>
+        <w:numPr>
+          <w:ilvl w:val="0"/>
+          <w:numId w:val="39"/>
+        </w:numPr>
+      </w:pPr>
+      <w:r>
+        <w:t>l</w:t>
+      </w:r>
+      <w:r>
+        <w:t>abel</w:t>
+      </w:r>
+      <w:r>
+        <w:t>: The</w:t>
+      </w:r>
+      <w:r>
+        <w:t xml:space="preserve"> Action</w:t>
+      </w:r>
+      <w:r>
+        <w:t xml:space="preserve"> object's </w:t>
+      </w:r>
+      <w:r>
+        <w:t>label</w:t>
+      </w:r>
+      <w:r>
+        <w:t>, used to display it</w:t>
+      </w:r>
+      <w:r>
+        <w:t xml:space="preserve"> or debug it</w:t>
+      </w:r>
+    </w:p>
+    <w:p>
+      <w:pPr>
+        <w:pStyle w:val="ListParagraph"/>
+        <w:numPr>
+          <w:ilvl w:val="0"/>
+          <w:numId w:val="39"/>
+        </w:numPr>
+      </w:pPr>
       <w:r>
         <w:t>s</w:t>
       </w:r>
       <w:r>
-        <w:t>.</w:t>
-      </w:r>
-    </w:p>
-    <w:p>
+        <w:t>ource</w:t>
+      </w:r>
+      <w:r>
+        <w:t>: The Combatant initiating the Action</w:t>
+      </w:r>
+    </w:p>
+    <w:p>
+      <w:pPr>
+        <w:pStyle w:val="ListParagraph"/>
+        <w:numPr>
+          <w:ilvl w:val="0"/>
+          <w:numId w:val="39"/>
+        </w:numPr>
+      </w:pPr>
+      <w:r>
+        <w:t>t</w:t>
+      </w:r>
+      <w:r>
+        <w:t>arget: The Combatant receiving the Action</w:t>
+      </w:r>
+    </w:p>
+    <w:p>
+      <w:pPr>
+        <w:pStyle w:val="ListParagraph"/>
+        <w:numPr>
+          <w:ilvl w:val="0"/>
+          <w:numId w:val="39"/>
+        </w:numPr>
+        <w:sectPr>
+          <w:type w:val="continuous"/>
+          <w:pgSz w:w="12240" w:h="15840"/>
+          <w:pgMar w:top="1440" w:right="1440" w:bottom="1440" w:left="1440" w:header="720" w:footer="720" w:gutter="0"/>
+          <w:cols w:sep="1" w:space="0"/>
+          <w:docGrid w:linePitch="360"/>
+        </w:sectPr>
+      </w:pPr>
+      <w:r>
+        <w:t>e</w:t>
+      </w:r>
+      <w:r>
+        <w:t>ffects</w:t>
+      </w:r>
+      <w:r>
+        <w:t xml:space="preserve"> (key/value with list of Effects  for each of the following)</w:t>
+      </w:r>
+    </w:p>
+    <w:p>
+      <w:pPr>
+        <w:pStyle w:val="ListParagraph"/>
+        <w:numPr>
+          <w:ilvl w:val="1"/>
+          <w:numId w:val="39"/>
+        </w:numPr>
+      </w:pPr>
+      <w:r>
+        <w:t>Critical Failure</w:t>
+      </w:r>
+    </w:p>
+    <w:p>
+      <w:pPr>
+        <w:pStyle w:val="ListParagraph"/>
+        <w:numPr>
+          <w:ilvl w:val="1"/>
+          <w:numId w:val="39"/>
+        </w:numPr>
+      </w:pPr>
+      <w:r>
+        <w:t>Failure</w:t>
+      </w:r>
+    </w:p>
+    <w:p>
+      <w:pPr>
+        <w:pStyle w:val="ListParagraph"/>
+        <w:numPr>
+          <w:ilvl w:val="1"/>
+          <w:numId w:val="39"/>
+        </w:numPr>
+      </w:pPr>
+      <w:r>
+        <w:t>Success</w:t>
+      </w:r>
+    </w:p>
+    <w:p>
+      <w:pPr>
+        <w:pStyle w:val="ListParagraph"/>
+        <w:numPr>
+          <w:ilvl w:val="1"/>
+          <w:numId w:val="39"/>
+        </w:numPr>
+        <w:rPr>
+          <w:i/>
+          <w:iCs/>
+        </w:rPr>
+        <w:sectPr>
+          <w:type w:val="continuous"/>
+          <w:pgSz w:w="12240" w:h="15840"/>
+          <w:pgMar w:top="1440" w:right="1440" w:bottom="1440" w:left="1440" w:header="720" w:footer="720" w:gutter="0"/>
+          <w:cols w:num="2" w:space="0"/>
+          <w:docGrid w:linePitch="360"/>
+        </w:sectPr>
+      </w:pPr>
+      <w:r>
+        <w:t>Critical success</w:t>
+      </w:r>
+    </w:p>
+    <w:p>
+      <w:pPr>
+        <w:pStyle w:val="ListParagraph"/>
+        <w:numPr>
+          <w:ilvl w:val="0"/>
+          <w:numId w:val="39"/>
+        </w:numPr>
+      </w:pPr>
+      <w:r>
+        <w:rPr>
+          <w:i/>
+          <w:iCs/>
+        </w:rPr>
+        <w:t>challenge</w:t>
+      </w:r>
+      <w:r>
+        <w:t xml:space="preserve">: </w:t>
+      </w:r>
+      <w:r>
+        <w:t>The challenge roll formula object</w:t>
+      </w:r>
+    </w:p>
+    <w:p>
+      <w:pPr>
+        <w:pStyle w:val="ListParagraph"/>
+        <w:numPr>
+          <w:ilvl w:val="1"/>
+          <w:numId w:val="39"/>
+        </w:numPr>
+      </w:pPr>
+      <w:r>
+        <w:t>sourceFormula</w:t>
+      </w:r>
+      <w:r>
+        <w:t xml:space="preserve">: </w:t>
+      </w:r>
+      <w:r>
+        <w:rPr>
+          <w:i/>
+          <w:iCs/>
+        </w:rPr>
+        <w:t xml:space="preserve">example: </w:t>
+      </w:r>
+      <w:r>
+        <w:rPr>
+          <w:i/>
+          <w:iCs/>
+        </w:rPr>
+        <w:t>Attack</w:t>
+      </w:r>
+      <w:r>
+        <w:rPr>
+          <w:i/>
+          <w:iCs/>
+        </w:rPr>
+        <w:t xml:space="preserve"> + MeleeAccuracy</w:t>
+      </w:r>
+    </w:p>
+    <w:p>
+      <w:pPr>
+        <w:pStyle w:val="ListParagraph"/>
+        <w:numPr>
+          <w:ilvl w:val="1"/>
+          <w:numId w:val="39"/>
+        </w:numPr>
+      </w:pPr>
+      <w:r>
+        <w:t>target</w:t>
+      </w:r>
+      <w:r>
+        <w:t>Formula</w:t>
+      </w:r>
+      <w:r>
+        <w:t xml:space="preserve">: </w:t>
+      </w:r>
+      <w:r>
+        <w:rPr>
+          <w:i/>
+          <w:iCs/>
+        </w:rPr>
+        <w:t>example: Defense</w:t>
+      </w:r>
+      <w:r>
+        <w:rPr>
+          <w:i/>
+          <w:iCs/>
+        </w:rPr>
+        <w:t xml:space="preserve"> + MeleeDefense</w:t>
+      </w:r>
+    </w:p>
+    <w:p>
+      <w:pPr>
+        <w:pStyle w:val="ListParagraph"/>
+        <w:numPr>
+          <w:ilvl w:val="0"/>
+          <w:numId w:val="39"/>
+        </w:numPr>
+      </w:pPr>
       <w:r>
         <w:rPr>
           <w:u w:val="single"/>
         </w:rPr>
-        <w:t>Slowed</w:t>
-      </w:r>
-      <w:r>
-        <w:t xml:space="preserve">: You lose one </w:t>
-      </w:r>
-      <w:r>
-        <w:t>Action on your next turn.</w:t>
-      </w:r>
-      <w:r>
-        <w:t xml:space="preserve"> If this stacks, you lose additional action</w:t>
-      </w:r>
-      <w:r>
-        <w:t>s</w:t>
-      </w:r>
-      <w:r>
-        <w:t>.</w:t>
-      </w:r>
-      <w:r>
-        <w:t xml:space="preserve"> </w:t>
-      </w:r>
-    </w:p>
-    <w:p>
-      <w:pPr>
-        <w:rPr>
-          <w:rFonts w:ascii="Cambria Math" w:hAnsi="Cambria Math" w:cs="Cambria Math"/>
-        </w:rPr>
-      </w:pPr>
+        <w:t>act</w:t>
+      </w:r>
+      <w:r>
+        <w:rPr>
+          <w:u w:val="single"/>
+        </w:rPr>
+        <w:t>()</w:t>
+      </w:r>
+      <w:r>
+        <w:t xml:space="preserve">: A function </w:t>
+      </w:r>
+      <w:r>
+        <w:t xml:space="preserve">that </w:t>
+      </w:r>
+      <w:r>
+        <w:t xml:space="preserve">rolls the challenge roll, </w:t>
+      </w:r>
+      <w:r>
+        <w:t xml:space="preserve">then </w:t>
+      </w:r>
+      <w:r>
+        <w:t>applies the Action's Effects to the Targets</w:t>
+      </w:r>
+      <w:r>
+        <w:t xml:space="preserve"> if successful</w:t>
+      </w:r>
+    </w:p>
+    <w:p>
+      <w:pPr>
+        <w:rPr>
+          <w:u w:val="single"/>
+        </w:rPr>
+      </w:pPr>
+      <w:r>
+        <w:rPr>
+          <w:u w:val="single"/>
+        </w:rPr>
+        <w:t>CombatEffect</w:t>
+      </w:r>
+    </w:p>
+    <w:p>
+      <w:pPr>
+        <w:pStyle w:val="ListParagraph"/>
+        <w:numPr>
+          <w:ilvl w:val="0"/>
+          <w:numId w:val="42"/>
+        </w:numPr>
+      </w:pPr>
+      <w:r>
+        <w:t>id: A unique id for this Effect</w:t>
+      </w:r>
+    </w:p>
+    <w:p>
+      <w:pPr>
+        <w:pStyle w:val="ListParagraph"/>
+        <w:numPr>
+          <w:ilvl w:val="0"/>
+          <w:numId w:val="42"/>
+        </w:numPr>
+      </w:pPr>
+      <w:r>
+        <w:t xml:space="preserve">label: The Effect object's </w:t>
+      </w:r>
+      <w:r>
+        <w:t>label, used to display it or debug it</w:t>
+      </w:r>
+    </w:p>
+    <w:p>
+      <w:pPr>
+        <w:pStyle w:val="ListParagraph"/>
+        <w:numPr>
+          <w:ilvl w:val="0"/>
+          <w:numId w:val="42"/>
+        </w:numPr>
+      </w:pPr>
+      <w:r>
+        <w:t>view: Determines how the Effect is displayed</w:t>
+      </w:r>
+    </w:p>
+    <w:p>
+      <w:pPr>
+        <w:pStyle w:val="ListParagraph"/>
+        <w:numPr>
+          <w:ilvl w:val="1"/>
+          <w:numId w:val="42"/>
+        </w:numPr>
+      </w:pPr>
+      <w:r>
+        <w:t>isVisible: Show the Effect?</w:t>
+      </w:r>
+    </w:p>
+    <w:p>
+      <w:pPr>
+        <w:pStyle w:val="ListParagraph"/>
+        <w:numPr>
+          <w:ilvl w:val="1"/>
+          <w:numId w:val="42"/>
+        </w:numPr>
+      </w:pPr>
+      <w:r>
+        <w:t>name</w:t>
+      </w:r>
+    </w:p>
+    <w:p>
+      <w:pPr>
+        <w:pStyle w:val="ListParagraph"/>
+        <w:numPr>
+          <w:ilvl w:val="1"/>
+          <w:numId w:val="42"/>
+        </w:numPr>
+      </w:pPr>
+      <w:r>
+        <w:t>description</w:t>
+      </w:r>
+    </w:p>
+    <w:p>
+      <w:pPr>
+        <w:pStyle w:val="ListParagraph"/>
+        <w:numPr>
+          <w:ilvl w:val="1"/>
+          <w:numId w:val="42"/>
+        </w:numPr>
+      </w:pPr>
+      <w:r>
+        <w:t>color</w:t>
+      </w:r>
+    </w:p>
+    <w:p>
+      <w:pPr>
+        <w:pStyle w:val="ListParagraph"/>
+        <w:numPr>
+          <w:ilvl w:val="1"/>
+          <w:numId w:val="42"/>
+        </w:numPr>
+      </w:pPr>
+      <w:r>
+        <w:t>icon</w:t>
+      </w:r>
+    </w:p>
+    <w:p>
+      <w:pPr>
+        <w:pStyle w:val="ListParagraph"/>
+        <w:numPr>
+          <w:ilvl w:val="0"/>
+          <w:numId w:val="42"/>
+        </w:numPr>
+      </w:pPr>
+      <w:r>
+        <w:t>souce</w:t>
+      </w:r>
+    </w:p>
+    <w:p>
+      <w:pPr>
+        <w:pStyle w:val="ListParagraph"/>
+        <w:numPr>
+          <w:ilvl w:val="0"/>
+          <w:numId w:val="42"/>
+        </w:numPr>
+      </w:pPr>
+      <w:r>
+        <w:t xml:space="preserve">actions: Actions </w:t>
+      </w:r>
       <w:r>
         <w:br w:type="page"/>
       </w:r>
@@ -10884,11 +12030,166 @@
       <w:r>
         <w:t>e</w:t>
       </w:r>
+    </w:p>
+    <w:p>
+      <w:pPr>
+        <w:pStyle w:val="Heading2"/>
+      </w:pPr>
+      <w:r>
+        <w:t xml:space="preserve">Starting </w:t>
+      </w:r>
+      <w:r>
+        <w:t>Abilities</w:t>
+      </w:r>
+    </w:p>
+    <w:p>
+      <w:r>
+        <w:rPr>
+          <w:u w:val="single"/>
+        </w:rPr>
+        <w:t>Raise Shield</w:t>
+      </w:r>
+      <w:r>
+        <w:t xml:space="preserve">: </w:t>
+      </w:r>
+      <w:r>
+        <w:rPr>
+          <w:rFonts w:ascii="Segoe UI Symbol" w:hAnsi="Segoe UI Symbol" w:cs="Segoe UI Symbol"/>
+        </w:rPr>
+        <w:t>◉</w:t>
+      </w:r>
+      <w:r>
+        <w:rPr>
+          <w:rFonts w:ascii="Segoe UI" w:hAnsi="Segoe UI" w:cs="Segoe UI"/>
+        </w:rPr>
+        <w:t>○○</w:t>
+      </w:r>
+      <w:r>
+        <w:rPr>
+          <w:rFonts w:ascii="Segoe UI" w:hAnsi="Segoe UI" w:cs="Segoe UI"/>
+        </w:rPr>
+        <w:t xml:space="preserve"> </w:t>
+      </w:r>
+      <w:r>
+        <w:rPr>
+          <w:rFonts w:cs="Cambria Math"/>
+        </w:rPr>
+        <w:t>1</w:t>
+      </w:r>
+      <w:r>
+        <w:rPr>
+          <w:rFonts w:ascii="Cambria Math" w:hAnsi="Cambria Math" w:cs="Cambria Math"/>
+        </w:rPr>
+        <w:t>↻</w:t>
+      </w:r>
+      <w:r>
+        <w:rPr>
+          <w:rFonts w:ascii="Cambria Math" w:hAnsi="Cambria Math" w:cs="Cambria Math"/>
+        </w:rPr>
+        <w:t xml:space="preserve"> </w:t>
+      </w:r>
+      <w:r>
+        <w:t>Increase</w:t>
+      </w:r>
+      <w:r>
+        <w:t xml:space="preserve"> your Defense +2</w:t>
+      </w:r>
+      <w:r>
+        <w:t xml:space="preserve"> </w:t>
+      </w:r>
+      <w:r>
+        <w:t>for 1</w:t>
+      </w:r>
+      <w:r>
+        <w:rPr>
+          <w:rFonts w:ascii="Cambria Math" w:hAnsi="Cambria Math" w:cs="Cambria Math"/>
+        </w:rPr>
+        <w:t>↻</w:t>
+      </w:r>
+      <w:r>
+        <w:t>.</w:t>
+      </w:r>
+    </w:p>
+    <w:p>
+      <w:pPr>
+        <w:rPr>
+          <w:rFonts w:ascii="Segoe UI" w:hAnsi="Segoe UI" w:cs="Segoe UI"/>
+          <w:color w:val="202122"/>
+          <w:shd w:val="clear" w:color="auto" w:fill="F8F9FA"/>
+        </w:rPr>
+      </w:pPr>
+      <w:r>
+        <w:rPr>
+          <w:u w:val="single"/>
+        </w:rPr>
+        <w:t>Challenge</w:t>
+      </w:r>
+      <w:r>
+        <w:t xml:space="preserve">: </w:t>
+      </w:r>
+      <w:r>
+        <w:rPr>
+          <w:rFonts w:ascii="Segoe UI Symbol" w:hAnsi="Segoe UI Symbol" w:cs="Segoe UI Symbol"/>
+        </w:rPr>
+        <w:t>◉◉</w:t>
+      </w:r>
+      <w:r>
+        <w:rPr>
+          <w:rFonts w:ascii="Segoe UI" w:hAnsi="Segoe UI" w:cs="Segoe UI"/>
+        </w:rPr>
+        <w:t>○</w:t>
+      </w:r>
+      <w:r>
+        <w:rPr>
+          <w:rFonts w:ascii="Segoe UI" w:hAnsi="Segoe UI" w:cs="Segoe UI"/>
+        </w:rPr>
+        <w:t xml:space="preserve"> </w:t>
+      </w:r>
+      <w:r>
+        <w:rPr>
+          <w:rFonts w:cs="Cambria Math"/>
+        </w:rPr>
+        <w:t>1</w:t>
+      </w:r>
+      <w:r>
+        <w:rPr>
+          <w:rFonts w:ascii="Cambria Math" w:hAnsi="Cambria Math" w:cs="Cambria Math"/>
+        </w:rPr>
+        <w:t>↻</w:t>
+      </w:r>
       <w:r>
         <w:rPr>
           <w:i/>
           <w:iCs/>
         </w:rPr>
+        <w:t xml:space="preserve"> </w:t>
+      </w:r>
+      <w:r>
+        <w:rPr>
+          <w:i/>
+          <w:iCs/>
+        </w:rPr>
+        <w:t>Threaten</w:t>
+      </w:r>
+      <w:r>
+        <w:t xml:space="preserve"> one enemy</w:t>
+      </w:r>
+      <w:r>
+        <w:t xml:space="preserve"> </w:t>
+      </w:r>
+      <w:r>
+        <w:t>for 1</w:t>
+      </w:r>
+      <w:r>
+        <w:rPr>
+          <w:rFonts w:ascii="Cambria Math" w:hAnsi="Cambria Math" w:cs="Cambria Math"/>
+        </w:rPr>
+        <w:t>↻</w:t>
+      </w:r>
+      <w:r>
+        <w:t>.</w:t>
+      </w:r>
+      <w:r>
         <w:br w:type="page"/>
       </w:r>
     </w:p>
@@ -10898,7 +12199,10 @@
       </w:pPr>
       <w:r>
         <w:lastRenderedPageBreak/>
-        <w:t>Vanguard Talents</w:t>
+        <w:t xml:space="preserve">Vanguard </w:t>
+      </w:r>
+      <w:r>
+        <w:t>Abilities</w:t>
       </w:r>
     </w:p>
     <w:tbl>
@@ -11086,23 +12390,37 @@
               <w:t xml:space="preserve">Deal light damage, and </w:t>
             </w:r>
             <w:r>
-              <w:rPr>
-                <w:i/>
-                <w:iCs/>
-              </w:rPr>
-              <w:t>threaten</w:t>
+              <w:t xml:space="preserve">apply </w:t>
+            </w:r>
+            <w:r>
+              <w:rPr>
+                <w:rStyle w:val="EffectChar"/>
+              </w:rPr>
+              <w:t>threatened</w:t>
+            </w:r>
+            <w:r>
+              <w:t xml:space="preserve"> to</w:t>
             </w:r>
             <w:r>
               <w:t xml:space="preserve"> </w:t>
             </w:r>
             <w:r>
-              <w:t xml:space="preserve">an enemy, </w:t>
-            </w:r>
-            <w:r>
-              <w:t xml:space="preserve">with a </w:t>
-            </w:r>
-            <w:r>
-              <w:t>chance to stun the enemy</w:t>
+              <w:t>a</w:t>
+            </w:r>
+            <w:r>
+              <w:t xml:space="preserve"> target</w:t>
+            </w:r>
+            <w:r>
+              <w:t>,</w:t>
+            </w:r>
+            <w:r>
+              <w:t xml:space="preserve"> and on a critical, apply </w:t>
+            </w:r>
+            <w:r>
+              <w:rPr>
+                <w:rStyle w:val="EffectChar"/>
+              </w:rPr>
+              <w:t>stunned</w:t>
             </w:r>
             <w:r>
               <w:t>.</w:t>
@@ -11117,7 +12435,7 @@
           </w:tcPr>
           <w:p>
             <w:r>
-              <w:t>Challenge</w:t>
+              <w:t>Valorous Interception</w:t>
             </w:r>
           </w:p>
         </w:tc>
@@ -11139,8 +12457,6 @@
             <w:pPr>
               <w:rPr>
                 <w:rFonts w:ascii="Segoe UI" w:hAnsi="Segoe UI" w:cs="Segoe UI"/>
-                <w:color w:val="202122"/>
-                <w:shd w:val="clear" w:color="auto" w:fill="F8F9FA"/>
               </w:rPr>
             </w:pPr>
             <w:r>
@@ -11158,10 +12474,7 @@
           </w:p>
           <w:p>
             <w:r>
-              <w:rPr>
-                <w:rFonts w:cs="Cambria Math"/>
-              </w:rPr>
-              <w:t>1</w:t>
+              <w:t>3</w:t>
             </w:r>
             <w:r>
               <w:rPr>
@@ -11177,17 +12490,22 @@
           </w:tcPr>
           <w:p>
             <w:r>
-              <w:rPr>
-                <w:i/>
-                <w:iCs/>
-              </w:rPr>
-              <w:t>Threaten</w:t>
-            </w:r>
-            <w:r>
-              <w:t xml:space="preserve"> one enemy for </w:t>
-            </w:r>
-            <w:r>
-              <w:t>1</w:t>
+              <w:t xml:space="preserve">Grant </w:t>
+            </w:r>
+            <w:r>
+              <w:rPr>
+                <w:rStyle w:val="EffectChar"/>
+              </w:rPr>
+              <w:t>protected</w:t>
+            </w:r>
+            <w:r>
+              <w:t xml:space="preserve"> to </w:t>
+            </w:r>
+            <w:r>
+              <w:t>an ally for</w:t>
+            </w:r>
+            <w:r>
+              <w:t xml:space="preserve"> 1</w:t>
             </w:r>
             <w:r>
               <w:rPr>
@@ -11196,6 +12514,9 @@
               <w:t>↻</w:t>
             </w:r>
             <w:r>
+              <w:rPr>
+                <w:rFonts w:ascii="Cambria Math" w:hAnsi="Cambria Math" w:cs="Cambria Math"/>
+              </w:rPr>
               <w:t>.</w:t>
             </w:r>
           </w:p>
@@ -11211,7 +12532,7 @@
           </w:tcPr>
           <w:p>
             <w:r>
-              <w:t>Intercept</w:t>
+              <w:t>Aggressive Tendencies</w:t>
             </w:r>
           </w:p>
         </w:tc>
@@ -11230,33 +12551,8 @@
             <w:tcW w:w="722" w:type="pct"/>
           </w:tcPr>
           <w:p>
-            <w:pPr>
-              <w:rPr>
-                <w:rFonts w:ascii="Segoe UI" w:hAnsi="Segoe UI" w:cs="Segoe UI"/>
-              </w:rPr>
-            </w:pPr>
-            <w:r>
-              <w:rPr>
-                <w:rFonts w:ascii="Segoe UI Symbol" w:hAnsi="Segoe UI Symbol" w:cs="Segoe UI Symbol"/>
-              </w:rPr>
-              <w:t>◉◉</w:t>
-            </w:r>
-            <w:r>
-              <w:rPr>
-                <w:rFonts w:ascii="Segoe UI" w:hAnsi="Segoe UI" w:cs="Segoe UI"/>
-              </w:rPr>
-              <w:t>○</w:t>
-            </w:r>
-          </w:p>
-          <w:p>
-            <w:r>
-              <w:t>3</w:t>
-            </w:r>
-            <w:r>
-              <w:rPr>
-                <w:rFonts w:ascii="Cambria Math" w:hAnsi="Cambria Math" w:cs="Cambria Math"/>
-              </w:rPr>
-              <w:t>↻</w:t>
+            <w:r>
+              <w:t>Passive</w:t>
             </w:r>
           </w:p>
         </w:tc>
@@ -11266,32 +12562,16 @@
           </w:tcPr>
           <w:p>
             <w:r>
-              <w:rPr>
-                <w:i/>
-                <w:iCs/>
-              </w:rPr>
-              <w:t>Protect</w:t>
-            </w:r>
-            <w:r>
-              <w:t xml:space="preserve"> an ally for</w:t>
-            </w:r>
-            <w:r>
-              <w:t xml:space="preserve"> 1</w:t>
-            </w:r>
-            <w:r>
-              <w:rPr>
-                <w:rFonts w:ascii="Cambria Math" w:hAnsi="Cambria Math" w:cs="Cambria Math"/>
-              </w:rPr>
-              <w:t>↻</w:t>
-            </w:r>
-            <w:r>
-              <w:rPr>
-                <w:rFonts w:cs="Cambria Math"/>
-              </w:rPr>
-              <w:t>, w</w:t>
-            </w:r>
-            <w:r>
-              <w:t>hen they are attacked, you take the damage instead</w:t>
+              <w:t xml:space="preserve">Enemies that attack your allies have a </w:t>
+            </w:r>
+            <w:r>
+              <w:t>5%</w:t>
+            </w:r>
+            <w:r>
+              <w:t xml:space="preserve"> chance of being </w:t>
+            </w:r>
+            <w:r>
+              <w:t>threatened</w:t>
             </w:r>
             <w:r>
               <w:t>.</w:t>
@@ -11306,7 +12586,10 @@
           </w:tcPr>
           <w:p>
             <w:r>
-              <w:t>Aggressive Tendencies</w:t>
+              <w:t>Brace</w:t>
+            </w:r>
+            <w:r>
+              <w:t xml:space="preserve"> Yourself</w:t>
             </w:r>
           </w:p>
         </w:tc>
@@ -11316,7 +12599,7 @@
           </w:tcPr>
           <w:p>
             <w:r>
-              <w:t>Control</w:t>
+              <w:t>Sustain Guard</w:t>
             </w:r>
           </w:p>
         </w:tc>
@@ -11325,8 +12608,33 @@
             <w:tcW w:w="722" w:type="pct"/>
           </w:tcPr>
           <w:p>
-            <w:r>
-              <w:t>Passive</w:t>
+            <w:pPr>
+              <w:rPr>
+                <w:rFonts w:ascii="Cambria Math" w:hAnsi="Cambria Math" w:cs="Cambria Math"/>
+              </w:rPr>
+            </w:pPr>
+            <w:r>
+              <w:rPr>
+                <w:rFonts w:ascii="Segoe UI Symbol" w:hAnsi="Segoe UI Symbol" w:cs="Segoe UI Symbol"/>
+              </w:rPr>
+              <w:t>◉◉</w:t>
+            </w:r>
+            <w:r>
+              <w:rPr>
+                <w:rFonts w:ascii="Segoe UI" w:hAnsi="Segoe UI" w:cs="Segoe UI"/>
+              </w:rPr>
+              <w:t>○</w:t>
+            </w:r>
+          </w:p>
+          <w:p>
+            <w:r>
+              <w:t>6</w:t>
+            </w:r>
+            <w:r>
+              <w:rPr>
+                <w:rFonts w:ascii="Cambria Math" w:hAnsi="Cambria Math" w:cs="Cambria Math"/>
+              </w:rPr>
+              <w:t>↻</w:t>
             </w:r>
           </w:p>
         </w:tc>
@@ -11336,10 +12644,16 @@
           </w:tcPr>
           <w:p>
             <w:r>
-              <w:t xml:space="preserve">Enemies that attack your allies have a small chance of being </w:t>
-            </w:r>
-            <w:r>
-              <w:t>threatened</w:t>
+              <w:t xml:space="preserve">Your Guard gains 50% physical resistance for </w:t>
+            </w:r>
+            <w:r>
+              <w:t>1</w:t>
+            </w:r>
+            <w:r>
+              <w:rPr>
+                <w:rFonts w:ascii="Cambria Math" w:hAnsi="Cambria Math" w:cs="Cambria Math"/>
+              </w:rPr>
+              <w:t>↻</w:t>
             </w:r>
             <w:r>
               <w:t>.</w:t>
@@ -11357,10 +12671,7 @@
           </w:tcPr>
           <w:p>
             <w:r>
-              <w:t>Brace</w:t>
-            </w:r>
-            <w:r>
-              <w:t xml:space="preserve"> Yourself</w:t>
+              <w:t>Defensive Stance</w:t>
             </w:r>
           </w:p>
         </w:tc>
@@ -11370,7 +12681,7 @@
           </w:tcPr>
           <w:p>
             <w:r>
-              <w:t>Sustain Guard</w:t>
+              <w:t>Survive, Sustain Guard</w:t>
             </w:r>
           </w:p>
         </w:tc>
@@ -11379,27 +12690,47 @@
             <w:tcW w:w="722" w:type="pct"/>
           </w:tcPr>
           <w:p>
-            <w:pPr>
+            <w:r>
+              <w:rPr>
+                <w:rFonts w:ascii="Segoe UI Symbol" w:hAnsi="Segoe UI Symbol" w:cs="Segoe UI Symbol"/>
+              </w:rPr>
+              <w:t>◉</w:t>
+            </w:r>
+            <w:r>
+              <w:rPr>
+                <w:rFonts w:ascii="Segoe UI" w:hAnsi="Segoe UI" w:cs="Segoe UI"/>
+              </w:rPr>
+              <w:t>○</w:t>
+            </w:r>
+            <w:r>
+              <w:rPr>
+                <w:rFonts w:ascii="Segoe UI" w:hAnsi="Segoe UI" w:cs="Segoe UI"/>
+              </w:rPr>
+              <w:t>○</w:t>
+            </w:r>
+          </w:p>
+          <w:p>
+            <w:r>
+              <w:t>3</w:t>
+            </w:r>
+            <w:r>
               <w:rPr>
                 <w:rFonts w:ascii="Cambria Math" w:hAnsi="Cambria Math" w:cs="Cambria Math"/>
               </w:rPr>
-            </w:pPr>
-            <w:r>
-              <w:rPr>
-                <w:rFonts w:ascii="Segoe UI Symbol" w:hAnsi="Segoe UI Symbol" w:cs="Segoe UI Symbol"/>
-              </w:rPr>
-              <w:t>◉◉</w:t>
-            </w:r>
-            <w:r>
-              <w:rPr>
-                <w:rFonts w:ascii="Segoe UI" w:hAnsi="Segoe UI" w:cs="Segoe UI"/>
-              </w:rPr>
-              <w:t>○</w:t>
-            </w:r>
-          </w:p>
-          <w:p>
-            <w:r>
-              <w:t>6</w:t>
+              <w:t>↻</w:t>
+            </w:r>
+          </w:p>
+        </w:tc>
+        <w:tc>
+          <w:tcPr>
+            <w:tcW w:w="2115" w:type="pct"/>
+          </w:tcPr>
+          <w:p>
+            <w:r>
+              <w:t xml:space="preserve">For </w:t>
+            </w:r>
+            <w:r>
+              <w:t>1</w:t>
             </w:r>
             <w:r>
               <w:rPr>
@@ -11407,24 +12738,8 @@
               </w:rPr>
               <w:t>↻</w:t>
             </w:r>
-          </w:p>
-        </w:tc>
-        <w:tc>
-          <w:tcPr>
-            <w:tcW w:w="2115" w:type="pct"/>
-          </w:tcPr>
-          <w:p>
-            <w:r>
-              <w:t xml:space="preserve">Your Guard gains 50% physical resistance for </w:t>
-            </w:r>
-            <w:r>
-              <w:t>1</w:t>
-            </w:r>
-            <w:r>
-              <w:rPr>
-                <w:rFonts w:ascii="Cambria Math" w:hAnsi="Cambria Math" w:cs="Cambria Math"/>
-              </w:rPr>
-              <w:t>↻</w:t>
+            <w:r>
+              <w:t>, your Guard gains increased resistance, and you cannot be stunned. When you are attacked, you gain a small amount of Guard (up to your max)</w:t>
             </w:r>
             <w:r>
               <w:t>.</w:t>
@@ -11439,7 +12754,10 @@
           </w:tcPr>
           <w:p>
             <w:r>
-              <w:t>Defensive Stance</w:t>
+              <w:t xml:space="preserve">Heavy Armor </w:t>
+            </w:r>
+            <w:r>
+              <w:t>Training (2)</w:t>
             </w:r>
           </w:p>
         </w:tc>
@@ -11449,7 +12767,7 @@
           </w:tcPr>
           <w:p>
             <w:r>
-              <w:t>Survive, Sustain Guard</w:t>
+              <w:t>Scale Guard</w:t>
             </w:r>
           </w:p>
         </w:tc>
@@ -11459,33 +12777,7 @@
           </w:tcPr>
           <w:p>
             <w:r>
-              <w:rPr>
-                <w:rFonts w:ascii="Segoe UI Symbol" w:hAnsi="Segoe UI Symbol" w:cs="Segoe UI Symbol"/>
-              </w:rPr>
-              <w:t>◉</w:t>
-            </w:r>
-            <w:r>
-              <w:rPr>
-                <w:rFonts w:ascii="Segoe UI" w:hAnsi="Segoe UI" w:cs="Segoe UI"/>
-              </w:rPr>
-              <w:t>○</w:t>
-            </w:r>
-            <w:r>
-              <w:rPr>
-                <w:rFonts w:ascii="Segoe UI" w:hAnsi="Segoe UI" w:cs="Segoe UI"/>
-              </w:rPr>
-              <w:t>○</w:t>
-            </w:r>
-          </w:p>
-          <w:p>
-            <w:r>
-              <w:t>3</w:t>
-            </w:r>
-            <w:r>
-              <w:rPr>
-                <w:rFonts w:ascii="Cambria Math" w:hAnsi="Cambria Math" w:cs="Cambria Math"/>
-              </w:rPr>
-              <w:t>↻</w:t>
+              <w:t>Passive</w:t>
             </w:r>
           </w:p>
         </w:tc>
@@ -11495,19 +12787,31 @@
           </w:tcPr>
           <w:p>
             <w:r>
-              <w:t xml:space="preserve">For </w:t>
-            </w:r>
-            <w:r>
-              <w:t>1</w:t>
-            </w:r>
-            <w:r>
-              <w:rPr>
-                <w:rFonts w:ascii="Cambria Math" w:hAnsi="Cambria Math" w:cs="Cambria Math"/>
-              </w:rPr>
-              <w:t>↻</w:t>
-            </w:r>
-            <w:r>
-              <w:t>, your Guard gains increased resistance, and you cannot be stunned. When you are attacked, you gain a small amount of Guard (up to your max)</w:t>
+              <w:t xml:space="preserve">Gain </w:t>
+            </w:r>
+            <w:r>
+              <w:t xml:space="preserve">more </w:t>
+            </w:r>
+            <w:r>
+              <w:t>Guard from heavy armor</w:t>
+            </w:r>
+            <w:r>
+              <w:t>.</w:t>
+            </w:r>
+            <w:r>
+              <w:t xml:space="preserve"> Guard </w:t>
+            </w:r>
+            <w:r>
+              <w:t xml:space="preserve">gets </w:t>
+            </w:r>
+            <w:r>
+              <w:t xml:space="preserve">a little </w:t>
+            </w:r>
+            <w:r>
+              <w:t>more</w:t>
+            </w:r>
+            <w:r>
+              <w:t xml:space="preserve"> physical resistance</w:t>
             </w:r>
             <w:r>
               <w:t>.</w:t>
@@ -11525,10 +12829,7 @@
           </w:tcPr>
           <w:p>
             <w:r>
-              <w:t xml:space="preserve">Heavy Armor </w:t>
-            </w:r>
-            <w:r>
-              <w:t>Training (2)</w:t>
+              <w:t>Steadfast</w:t>
             </w:r>
           </w:p>
         </w:tc>
@@ -11538,7 +12839,7 @@
           </w:tcPr>
           <w:p>
             <w:r>
-              <w:t>Scale Guard</w:t>
+              <w:t>Survive</w:t>
             </w:r>
           </w:p>
         </w:tc>
@@ -11558,31 +12859,25 @@
           </w:tcPr>
           <w:p>
             <w:r>
-              <w:t xml:space="preserve">Gain </w:t>
-            </w:r>
-            <w:r>
-              <w:t xml:space="preserve">more </w:t>
-            </w:r>
-            <w:r>
-              <w:t>Guard from heavy armor</w:t>
-            </w:r>
-            <w:r>
-              <w:t>.</w:t>
-            </w:r>
-            <w:r>
-              <w:t xml:space="preserve"> Guard </w:t>
-            </w:r>
-            <w:r>
-              <w:t xml:space="preserve">gets </w:t>
-            </w:r>
-            <w:r>
-              <w:t xml:space="preserve">a little </w:t>
-            </w:r>
-            <w:r>
-              <w:t>more</w:t>
-            </w:r>
-            <w:r>
-              <w:t xml:space="preserve"> physical resistance</w:t>
+              <w:t xml:space="preserve">+5 Health/Level, </w:t>
+            </w:r>
+            <w:r>
+              <w:t xml:space="preserve">Raise </w:t>
+            </w:r>
+            <w:r>
+              <w:t xml:space="preserve">the Guard </w:t>
+            </w:r>
+            <w:r>
+              <w:t xml:space="preserve">from health </w:t>
+            </w:r>
+            <w:r>
+              <w:t>ratio</w:t>
+            </w:r>
+            <w:r>
+              <w:t xml:space="preserve"> by</w:t>
+            </w:r>
+            <w:r>
+              <w:t xml:space="preserve"> 5%</w:t>
             </w:r>
             <w:r>
               <w:t>.</w:t>
@@ -11591,72 +12886,6 @@
         </w:tc>
       </w:tr>
       <w:tr>
-        <w:tc>
-          <w:tcPr>
-            <w:tcW w:w="1104" w:type="pct"/>
-          </w:tcPr>
-          <w:p>
-            <w:r>
-              <w:t>Steadfast</w:t>
-            </w:r>
-          </w:p>
-        </w:tc>
-        <w:tc>
-          <w:tcPr>
-            <w:tcW w:w="1059" w:type="pct"/>
-          </w:tcPr>
-          <w:p>
-            <w:r>
-              <w:t>Survive</w:t>
-            </w:r>
-          </w:p>
-        </w:tc>
-        <w:tc>
-          <w:tcPr>
-            <w:tcW w:w="722" w:type="pct"/>
-          </w:tcPr>
-          <w:p>
-            <w:r>
-              <w:t>Passive</w:t>
-            </w:r>
-          </w:p>
-        </w:tc>
-        <w:tc>
-          <w:tcPr>
-            <w:tcW w:w="2115" w:type="pct"/>
-          </w:tcPr>
-          <w:p>
-            <w:r>
-              <w:t xml:space="preserve">+5 Health/Level, </w:t>
-            </w:r>
-            <w:r>
-              <w:t xml:space="preserve">Raise </w:t>
-            </w:r>
-            <w:r>
-              <w:t xml:space="preserve">the Guard </w:t>
-            </w:r>
-            <w:r>
-              <w:t xml:space="preserve">from health </w:t>
-            </w:r>
-            <w:r>
-              <w:t>ratio</w:t>
-            </w:r>
-            <w:r>
-              <w:t xml:space="preserve"> by</w:t>
-            </w:r>
-            <w:r>
-              <w:t xml:space="preserve"> 5%</w:t>
-            </w:r>
-            <w:r>
-              <w:t>.</w:t>
-            </w:r>
-          </w:p>
-        </w:tc>
-      </w:tr>
-      <w:tr>
-        <w:trPr>
-          <w:cnfStyle w:val="000000010000" w:firstRow="0" w:lastRow="0" w:firstColumn="0" w:lastColumn="0" w:oddVBand="0" w:evenVBand="0" w:oddHBand="0" w:evenHBand="1" w:firstRowFirstColumn="0" w:firstRowLastColumn="0" w:lastRowFirstColumn="0" w:lastRowLastColumn="0"/>
-        </w:trPr>
         <w:tc>
           <w:tcPr>
             <w:tcW w:w="1104" w:type="pct"/>
@@ -11900,7 +13129,7 @@
               <w:jc w:val="center"/>
             </w:pPr>
             <w:r>
-              <w:t>Hunt</w:t>
+              <w:t>Mark &amp; Hunted</w:t>
             </w:r>
           </w:p>
         </w:tc>
@@ -11941,27 +13170,23 @@
           </w:tcPr>
           <w:p>
             <w:r>
+              <w:t>Mark</w:t>
+            </w:r>
+            <w:r>
+              <w:t xml:space="preserve"> an enemy as </w:t>
+            </w:r>
+            <w:r>
               <w:rPr>
                 <w:i/>
                 <w:iCs/>
               </w:rPr>
-              <w:t>Mark</w:t>
-            </w:r>
-            <w:r>
-              <w:t xml:space="preserve"> an enemy as </w:t>
+              <w:t>Hunted</w:t>
             </w:r>
             <w:r>
               <w:rPr>
                 <w:i/>
                 <w:iCs/>
               </w:rPr>
-              <w:t>Hunted</w:t>
-            </w:r>
-            <w:r>
-              <w:rPr>
-                <w:i/>
-                <w:iCs/>
-              </w:rPr>
               <w:t xml:space="preserve">. </w:t>
             </w:r>
             <w:r>
@@ -12041,6 +13266,140 @@
       </w:r>
       <w:r>
         <w:t xml:space="preserve"> Benefit</w:t>
+      </w:r>
+    </w:p>
+    <w:p>
+      <w:pPr>
+        <w:pStyle w:val="Heading2"/>
+      </w:pPr>
+      <w:r>
+        <w:t>Starting Abilities</w:t>
+      </w:r>
+    </w:p>
+    <w:p>
+      <w:r>
+        <w:rPr>
+          <w:u w:val="single"/>
+        </w:rPr>
+        <w:t>Hunt</w:t>
+      </w:r>
+      <w:r>
+        <w:rPr>
+          <w:u w:val="single"/>
+        </w:rPr>
+        <w:t xml:space="preserve"> Prey</w:t>
+      </w:r>
+      <w:r>
+        <w:t xml:space="preserve">: </w:t>
+      </w:r>
+      <w:r>
+        <w:rPr>
+          <w:rFonts w:ascii="Segoe UI Symbol" w:hAnsi="Segoe UI Symbol" w:cs="Segoe UI Symbol"/>
+        </w:rPr>
+        <w:t>◉</w:t>
+      </w:r>
+      <w:r>
+        <w:rPr>
+          <w:rFonts w:ascii="Segoe UI" w:hAnsi="Segoe UI" w:cs="Segoe UI"/>
+        </w:rPr>
+        <w:t>○○</w:t>
+      </w:r>
+      <w:r>
+        <w:rPr>
+          <w:rFonts w:ascii="Segoe UI" w:hAnsi="Segoe UI" w:cs="Segoe UI"/>
+        </w:rPr>
+        <w:t xml:space="preserve"> </w:t>
+      </w:r>
+      <w:r>
+        <w:rPr>
+          <w:rFonts w:cs="Cambria Math"/>
+        </w:rPr>
+        <w:t>1</w:t>
+      </w:r>
+      <w:r>
+        <w:rPr>
+          <w:rFonts w:ascii="Cambria Math" w:hAnsi="Cambria Math" w:cs="Cambria Math"/>
+        </w:rPr>
+        <w:t>↻</w:t>
+      </w:r>
+      <w:r>
+        <w:rPr>
+          <w:rFonts w:ascii="Cambria Math" w:hAnsi="Cambria Math" w:cs="Cambria Math"/>
+        </w:rPr>
+        <w:t xml:space="preserve"> </w:t>
+      </w:r>
+      <w:r>
+        <w:t xml:space="preserve">Mark an enemy </w:t>
+      </w:r>
+      <w:r>
+        <w:t>as your prey.</w:t>
+      </w:r>
+      <w:r>
+        <w:t xml:space="preserve"> Only one enemy can be marked by you at a time.</w:t>
+      </w:r>
+      <w:r>
+        <w:t xml:space="preserve"> They will </w:t>
+      </w:r>
+      <w:r>
+        <w:t xml:space="preserve">gain the Effect </w:t>
+      </w:r>
+      <w:r>
+        <w:rPr>
+          <w:i/>
+          <w:iCs/>
+        </w:rPr>
+        <w:t>Hunted</w:t>
+      </w:r>
+      <w:r>
+        <w:t xml:space="preserve"> which will stay applied</w:t>
+      </w:r>
+      <w:r>
+        <w:t xml:space="preserve"> until they die or it is dispelled.</w:t>
+      </w:r>
+      <w:r>
+        <w:t xml:space="preserve"> You </w:t>
+      </w:r>
+      <w:r>
+        <w:t>gain</w:t>
+      </w:r>
+      <w:r>
+        <w:t xml:space="preserve"> </w:t>
+      </w:r>
+      <w:r>
+        <w:t xml:space="preserve">+1 </w:t>
+      </w:r>
+      <w:r>
+        <w:t xml:space="preserve">during a challenge roll </w:t>
+      </w:r>
+      <w:r>
+        <w:t>targeting</w:t>
+      </w:r>
+      <w:r>
+        <w:t xml:space="preserve"> your Prey</w:t>
+      </w:r>
+      <w:r>
+        <w:t xml:space="preserve"> and gain </w:t>
+      </w:r>
+      <w:r>
+        <w:t>+</w:t>
+      </w:r>
+      <w:r>
+        <w:t>10</w:t>
+      </w:r>
+      <w:r>
+        <w:t>%</w:t>
+      </w:r>
+      <w:r>
+        <w:t xml:space="preserve"> </w:t>
+      </w:r>
+      <w:r>
+        <w:t xml:space="preserve">physical </w:t>
+      </w:r>
+      <w:r>
+        <w:t>damage</w:t>
+      </w:r>
+      <w:r>
+        <w:t>.</w:t>
       </w:r>
       <w:r>
         <w:rPr>
@@ -12181,6 +13540,14 @@
               <w:t>Deadly Aim</w:t>
             </w:r>
           </w:p>
+          <w:p>
+            <w:pPr>
+              <w:pStyle w:val="Info"/>
+            </w:pPr>
+            <w:r>
+              <w:t>Ranged</w:t>
+            </w:r>
+          </w:p>
         </w:tc>
         <w:tc>
           <w:tcPr>
@@ -12218,19 +13585,24 @@
             </w:r>
             <w:r>
               <w:rPr>
+                <w:rStyle w:val="EffectChar"/>
+              </w:rPr>
+              <w:t>Hunted</w:t>
+            </w:r>
+            <w:r>
+              <w:rPr>
+                <w:color w:val="77206D" w:themeColor="accent5" w:themeShade="BF"/>
+              </w:rPr>
+              <w:t xml:space="preserve"> </w:t>
+            </w:r>
+            <w:r>
+              <w:t xml:space="preserve">target is also </w:t>
+            </w:r>
+            <w:r>
+              <w:rPr>
                 <w:i/>
                 <w:iCs/>
               </w:rPr>
-              <w:t>Hunted</w:t>
-            </w:r>
-            <w:r>
-              <w:t xml:space="preserve"> target is also </w:t>
-            </w:r>
-            <w:r>
-              <w:rPr>
-                <w:i/>
-                <w:iCs/>
-              </w:rPr>
               <w:t>Off Guard</w:t>
             </w:r>
             <w:r>
@@ -12250,6 +13622,14 @@
           <w:p>
             <w:r>
               <w:t>Pinning Shot</w:t>
+            </w:r>
+          </w:p>
+          <w:p>
+            <w:pPr>
+              <w:pStyle w:val="Info"/>
+            </w:pPr>
+            <w:r>
+              <w:t>Ranged</w:t>
             </w:r>
           </w:p>
         </w:tc>
@@ -12307,17 +13687,13 @@
           </w:tcPr>
           <w:p>
             <w:r>
-              <w:t xml:space="preserve">Fire a shot that roots your </w:t>
-            </w:r>
-            <w:r>
-              <w:rPr>
-                <w:i/>
-                <w:iCs/>
-              </w:rPr>
-              <w:t>Hunted</w:t>
-            </w:r>
-            <w:r>
-              <w:t xml:space="preserve"> target in place for 1</w:t>
+              <w:t>Fire a shot that roots you</w:t>
+            </w:r>
+            <w:r>
+              <w:t xml:space="preserve">r </w:t>
+            </w:r>
+            <w:r>
+              <w:t>target in place for 1</w:t>
             </w:r>
             <w:r>
               <w:rPr>
@@ -12330,8 +13706,7 @@
             </w:r>
             <w:r>
               <w:rPr>
-                <w:i/>
-                <w:iCs/>
+                <w:rStyle w:val="EffectChar"/>
               </w:rPr>
               <w:t>Slowed</w:t>
             </w:r>
@@ -12387,13 +13762,30 @@
             </w:r>
             <w:r>
               <w:rPr>
-                <w:i/>
-                <w:iCs/>
+                <w:rStyle w:val="EffectChar"/>
               </w:rPr>
               <w:t>Hunted</w:t>
             </w:r>
             <w:r>
-              <w:t xml:space="preserve"> target deals +5% damage, stacking up to 3 times. Stacks reset if you attack a different target.</w:t>
+              <w:rPr>
+                <w:color w:val="77206D" w:themeColor="accent5" w:themeShade="BF"/>
+              </w:rPr>
+              <w:t xml:space="preserve"> </w:t>
+            </w:r>
+            <w:r>
+              <w:t>target</w:t>
+            </w:r>
+            <w:r>
+              <w:t xml:space="preserve"> grants them </w:t>
+            </w:r>
+            <w:r>
+              <w:rPr>
+                <w:rStyle w:val="EffectChar"/>
+              </w:rPr>
+              <w:t>Bleed</w:t>
+            </w:r>
+            <w:r>
+              <w:t>. Stacks reset if you attack a different target.</w:t>
             </w:r>
           </w:p>
         </w:tc>
@@ -12405,7 +13797,15 @@
           </w:tcPr>
           <w:p>
             <w:r>
-              <w:t>Rapid Shot</w:t>
+              <w:t>Flurry</w:t>
+            </w:r>
+          </w:p>
+          <w:p>
+            <w:pPr>
+              <w:pStyle w:val="Info"/>
+            </w:pPr>
+            <w:r>
+              <w:t>Ranged</w:t>
             </w:r>
           </w:p>
         </w:tc>
@@ -12432,9 +13832,15 @@
             </w:r>
             <w:r>
               <w:rPr>
+                <w:rFonts w:ascii="Segoe UI Symbol" w:hAnsi="Segoe UI Symbol" w:cs="Segoe UI Symbol"/>
+              </w:rPr>
+              <w:t>◉</w:t>
+            </w:r>
+            <w:r>
+              <w:rPr>
                 <w:rFonts w:ascii="Segoe UI" w:hAnsi="Segoe UI" w:cs="Segoe UI"/>
               </w:rPr>
-              <w:t>○○</w:t>
+              <w:t>○</w:t>
             </w:r>
           </w:p>
           <w:p>
@@ -12455,7 +13861,10 @@
           </w:tcPr>
           <w:p>
             <w:r>
-              <w:t>Fire twice in quick succession at your Hunted target for reduced damage per hit.</w:t>
+              <w:t>Fire twice in quick succession</w:t>
+            </w:r>
+            <w:r>
+              <w:t>.</w:t>
             </w:r>
           </w:p>
         </w:tc>
@@ -12473,6 +13882,14 @@
               <w:t>Uncanny dodge</w:t>
             </w:r>
           </w:p>
+          <w:p>
+            <w:pPr>
+              <w:pStyle w:val="Info"/>
+            </w:pPr>
+            <w:r>
+              <w:t>Reaction</w:t>
+            </w:r>
+          </w:p>
         </w:tc>
         <w:tc>
           <w:tcPr>
@@ -12489,8 +13906,19 @@
             <w:tcW w:w="722" w:type="pct"/>
           </w:tcPr>
           <w:p>
-            <w:r>
-              <w:t>Passive</w:t>
+            <w:pPr>
+              <w:rPr>
+                <w:b/>
+                <w:bCs/>
+              </w:rPr>
+            </w:pPr>
+            <w:r>
+              <w:rPr>
+                <w:rFonts w:ascii="Cambria Math" w:hAnsi="Cambria Math" w:cs="Cambria Math"/>
+                <w:b/>
+                <w:bCs/>
+              </w:rPr>
+              <w:t>⇌</w:t>
             </w:r>
           </w:p>
         </w:tc>
@@ -12500,7 +13928,19 @@
           </w:tcPr>
           <w:p>
             <w:r>
-              <w:t>Once per encounter, when an attack would hit you, reduce the damage by 50%.</w:t>
+              <w:t xml:space="preserve">Once per encounter, when </w:t>
+            </w:r>
+            <w:r>
+              <w:t>attacked</w:t>
+            </w:r>
+            <w:r>
+              <w:t xml:space="preserve">, </w:t>
+            </w:r>
+            <w:r>
+              <w:t>you're grazed instead. R</w:t>
+            </w:r>
+            <w:r>
+              <w:t>educe the damage by 50%.</w:t>
             </w:r>
           </w:p>
         </w:tc>
@@ -12512,7 +13952,7 @@
           </w:tcPr>
           <w:p>
             <w:r>
-              <w:t>Lurker</w:t>
+              <w:t>Deep Breaths</w:t>
             </w:r>
           </w:p>
         </w:tc>
@@ -12532,7 +13972,33 @@
           </w:tcPr>
           <w:p>
             <w:r>
-              <w:t>Passive</w:t>
+              <w:rPr>
+                <w:rFonts w:ascii="Segoe UI Symbol" w:hAnsi="Segoe UI Symbol" w:cs="Segoe UI Symbol"/>
+              </w:rPr>
+              <w:t>◉</w:t>
+            </w:r>
+            <w:r>
+              <w:rPr>
+                <w:rFonts w:ascii="Segoe UI" w:hAnsi="Segoe UI" w:cs="Segoe UI"/>
+              </w:rPr>
+              <w:t>○</w:t>
+            </w:r>
+            <w:r>
+              <w:rPr>
+                <w:rFonts w:ascii="Segoe UI" w:hAnsi="Segoe UI" w:cs="Segoe UI"/>
+              </w:rPr>
+              <w:t>○</w:t>
+            </w:r>
+          </w:p>
+          <w:p>
+            <w:r>
+              <w:t>1</w:t>
+            </w:r>
+            <w:r>
+              <w:rPr>
+                <w:rFonts w:ascii="Cambria Math" w:hAnsi="Cambria Math" w:cs="Cambria Math"/>
+              </w:rPr>
+              <w:t>↻</w:t>
             </w:r>
           </w:p>
         </w:tc>
@@ -12542,7 +14008,33 @@
           </w:tcPr>
           <w:p>
             <w:r>
-              <w:t>If you did not take damage last turn, gain +1 Ranged Accuracy and +10% damage on your next attack.</w:t>
+              <w:t>Gain</w:t>
+            </w:r>
+            <w:r>
+              <w:t xml:space="preserve"> </w:t>
+            </w:r>
+            <w:r>
+              <w:rPr>
+                <w:rStyle w:val="EffectChar"/>
+              </w:rPr>
+              <w:t>Steady</w:t>
+            </w:r>
+            <w:r>
+              <w:rPr>
+                <w:rStyle w:val="EffectChar"/>
+              </w:rPr>
+              <w:t xml:space="preserve"> </w:t>
+            </w:r>
+            <w:r>
+              <w:rPr>
+                <w:rStyle w:val="EffectChar"/>
+                <w:i w:val="0"/>
+                <w:iCs/>
+              </w:rPr>
+              <w:t>for 1</w:t>
+            </w:r>
+            <w:r>
+              <w:t>.</w:t>
             </w:r>
           </w:p>
         </w:tc>
@@ -12667,8 +14159,7 @@
             </w:r>
             <w:r>
               <w:rPr>
-                <w:i/>
-                <w:iCs/>
+                <w:rStyle w:val="EffectChar"/>
               </w:rPr>
               <w:t>Hunted</w:t>
             </w:r>
@@ -12676,14 +14167,10 @@
               <w:t xml:space="preserve"> target below 30% Health. If it kills them, reset your </w:t>
             </w:r>
             <w:r>
-              <w:rPr>
-                <w:i/>
-                <w:iCs/>
-              </w:rPr>
-              <w:t>Hunt</w:t>
-            </w:r>
-            <w:r>
-              <w:t xml:space="preserve"> and reduce this talent's cooldown to 1</w:t>
+              <w:t xml:space="preserve">Mark for free </w:t>
+            </w:r>
+            <w:r>
+              <w:t>and reduce this talent's cooldown to 1</w:t>
             </w:r>
             <w:r>
               <w:rPr>
@@ -12823,10 +14310,17 @@
           </w:tcPr>
           <w:p>
             <w:r>
-              <w:lastRenderedPageBreak/>
               <w:t>Below the Belt</w:t>
             </w:r>
           </w:p>
+          <w:p>
+            <w:pPr>
+              <w:pStyle w:val="Info"/>
+            </w:pPr>
+            <w:r>
+              <w:t>Melee</w:t>
+            </w:r>
+          </w:p>
         </w:tc>
         <w:tc>
           <w:tcPr>
@@ -12874,8 +14368,7 @@
             </w:r>
             <w:r>
               <w:rPr>
-                <w:i/>
-                <w:iCs/>
+                <w:rStyle w:val="EffectChar"/>
               </w:rPr>
               <w:t>Slowed</w:t>
             </w:r>
@@ -12902,6 +14395,7 @@
     <w:p/>
     <w:p>
       <w:r>
+        <w:lastRenderedPageBreak/>
         <w:br w:type="page"/>
       </w:r>
     </w:p>
@@ -13029,7 +14523,7 @@
   <w:abstractNum w:abstractNumId="0" w15:restartNumberingAfterBreak="0">
     <w:nsid w:val="00E57A50"/>
     <w:multiLevelType w:val="hybridMultilevel"/>
-    <w:tmpl w:val="4962BF14"/>
+    <w:tmpl w:val="38B4D22C"/>
     <w:lvl w:ilvl="0" w:tplc="0409000F">
       <w:start w:val="1"/>
       <w:numFmt w:val="decimal"/>
@@ -14109,6 +15603,119 @@
     </w:lvl>
   </w:abstractNum>
   <w:abstractNum w:abstractNumId="10" w15:restartNumberingAfterBreak="0">
+    <w:nsid w:val="1A457087"/>
+    <w:multiLevelType w:val="hybridMultilevel"/>
+    <w:tmpl w:val="76CAB7A8"/>
+    <w:lvl w:ilvl="0" w:tplc="04090001">
+      <w:start w:val="1"/>
+      <w:numFmt w:val="bullet"/>
+      <w:lvlText w:val=""/>
+      <w:lvlJc w:val="left"/>
+      <w:pPr>
+        <w:ind w:left="720" w:hanging="360"/>
+      </w:pPr>
+      <w:rPr>
+        <w:rFonts w:ascii="Symbol" w:hAnsi="Symbol" w:hint="default"/>
+      </w:rPr>
+    </w:lvl>
+    <w:lvl w:ilvl="1" w:tplc="04090003">
+      <w:start w:val="1"/>
+      <w:numFmt w:val="bullet"/>
+      <w:lvlText w:val="o"/>
+      <w:lvlJc w:val="left"/>
+      <w:pPr>
+        <w:ind w:left="1440" w:hanging="360"/>
+      </w:pPr>
+      <w:rPr>
+        <w:rFonts w:ascii="Courier New" w:hAnsi="Courier New" w:cs="Courier New" w:hint="default"/>
+      </w:rPr>
+    </w:lvl>
+    <w:lvl w:ilvl="2" w:tplc="04090005" w:tentative="1">
+      <w:start w:val="1"/>
+      <w:numFmt w:val="bullet"/>
+      <w:lvlText w:val=""/>
+      <w:lvlJc w:val="left"/>
+      <w:pPr>
+        <w:ind w:left="2160" w:hanging="360"/>
+      </w:pPr>
+      <w:rPr>
+        <w:rFonts w:ascii="Wingdings" w:hAnsi="Wingdings" w:hint="default"/>
+      </w:rPr>
+    </w:lvl>
+    <w:lvl w:ilvl="3" w:tplc="04090001" w:tentative="1">
+      <w:start w:val="1"/>
+      <w:numFmt w:val="bullet"/>
+      <w:lvlText w:val=""/>
+      <w:lvlJc w:val="left"/>
+      <w:pPr>
+        <w:ind w:left="2880" w:hanging="360"/>
+      </w:pPr>
+      <w:rPr>
+        <w:rFonts w:ascii="Symbol" w:hAnsi="Symbol" w:hint="default"/>
+      </w:rPr>
+    </w:lvl>
+    <w:lvl w:ilvl="4" w:tplc="04090003" w:tentative="1">
+      <w:start w:val="1"/>
+      <w:numFmt w:val="bullet"/>
+      <w:lvlText w:val="o"/>
+      <w:lvlJc w:val="left"/>
+      <w:pPr>
+        <w:ind w:left="3600" w:hanging="360"/>
+      </w:pPr>
+      <w:rPr>
+        <w:rFonts w:ascii="Courier New" w:hAnsi="Courier New" w:cs="Courier New" w:hint="default"/>
+      </w:rPr>
+    </w:lvl>
+    <w:lvl w:ilvl="5" w:tplc="04090005" w:tentative="1">
+      <w:start w:val="1"/>
+      <w:numFmt w:val="bullet"/>
+      <w:lvlText w:val=""/>
+      <w:lvlJc w:val="left"/>
+      <w:pPr>
+        <w:ind w:left="4320" w:hanging="360"/>
+      </w:pPr>
+      <w:rPr>
+        <w:rFonts w:ascii="Wingdings" w:hAnsi="Wingdings" w:hint="default"/>
+      </w:rPr>
+    </w:lvl>
+    <w:lvl w:ilvl="6" w:tplc="04090001" w:tentative="1">
+      <w:start w:val="1"/>
+      <w:numFmt w:val="bullet"/>
+      <w:lvlText w:val=""/>
+      <w:lvlJc w:val="left"/>
+      <w:pPr>
+        <w:ind w:left="5040" w:hanging="360"/>
+      </w:pPr>
+      <w:rPr>
+        <w:rFonts w:ascii="Symbol" w:hAnsi="Symbol" w:hint="default"/>
+      </w:rPr>
+    </w:lvl>
+    <w:lvl w:ilvl="7" w:tplc="04090003" w:tentative="1">
+      <w:start w:val="1"/>
+      <w:numFmt w:val="bullet"/>
+      <w:lvlText w:val="o"/>
+      <w:lvlJc w:val="left"/>
+      <w:pPr>
+        <w:ind w:left="5760" w:hanging="360"/>
+      </w:pPr>
+      <w:rPr>
+        <w:rFonts w:ascii="Courier New" w:hAnsi="Courier New" w:cs="Courier New" w:hint="default"/>
+      </w:rPr>
+    </w:lvl>
+    <w:lvl w:ilvl="8" w:tplc="04090005" w:tentative="1">
+      <w:start w:val="1"/>
+      <w:numFmt w:val="bullet"/>
+      <w:lvlText w:val=""/>
+      <w:lvlJc w:val="left"/>
+      <w:pPr>
+        <w:ind w:left="6480" w:hanging="360"/>
+      </w:pPr>
+      <w:rPr>
+        <w:rFonts w:ascii="Wingdings" w:hAnsi="Wingdings" w:hint="default"/>
+      </w:rPr>
+    </w:lvl>
+  </w:abstractNum>
+  <w:abstractNum w:abstractNumId="11" w15:restartNumberingAfterBreak="0">
     <w:nsid w:val="1C052AC9"/>
     <w:multiLevelType w:val="hybridMultilevel"/>
     <w:tmpl w:val="F34E7910"/>
@@ -14221,7 +15828,7 @@
       </w:rPr>
     </w:lvl>
   </w:abstractNum>
-  <w:abstractNum w:abstractNumId="11" w15:restartNumberingAfterBreak="0">
+  <w:abstractNum w:abstractNumId="12" w15:restartNumberingAfterBreak="0">
     <w:nsid w:val="1D5047C7"/>
     <w:multiLevelType w:val="hybridMultilevel"/>
     <w:tmpl w:val="B360ED64"/>
@@ -14334,7 +15941,7 @@
       </w:rPr>
     </w:lvl>
   </w:abstractNum>
-  <w:abstractNum w:abstractNumId="12" w15:restartNumberingAfterBreak="0">
+  <w:abstractNum w:abstractNumId="13" w15:restartNumberingAfterBreak="0">
     <w:nsid w:val="210751B6"/>
     <w:multiLevelType w:val="hybridMultilevel"/>
     <w:tmpl w:val="D298C59E"/>
@@ -14447,7 +16054,7 @@
       </w:rPr>
     </w:lvl>
   </w:abstractNum>
-  <w:abstractNum w:abstractNumId="13" w15:restartNumberingAfterBreak="0">
+  <w:abstractNum w:abstractNumId="14" w15:restartNumberingAfterBreak="0">
     <w:nsid w:val="269B3172"/>
     <w:multiLevelType w:val="hybridMultilevel"/>
     <w:tmpl w:val="285839DC"/>
@@ -14560,7 +16167,120 @@
       </w:rPr>
     </w:lvl>
   </w:abstractNum>
-  <w:abstractNum w:abstractNumId="14" w15:restartNumberingAfterBreak="0">
+  <w:abstractNum w:abstractNumId="15" w15:restartNumberingAfterBreak="0">
+    <w:nsid w:val="27A51D6C"/>
+    <w:multiLevelType w:val="hybridMultilevel"/>
+    <w:tmpl w:val="CE6A4A1C"/>
+    <w:lvl w:ilvl="0" w:tplc="04090001">
+      <w:start w:val="1"/>
+      <w:numFmt w:val="bullet"/>
+      <w:lvlText w:val=""/>
+      <w:lvlJc w:val="left"/>
+      <w:pPr>
+        <w:ind w:left="3600" w:hanging="360"/>
+      </w:pPr>
+      <w:rPr>
+        <w:rFonts w:ascii="Symbol" w:hAnsi="Symbol" w:hint="default"/>
+      </w:rPr>
+    </w:lvl>
+    <w:lvl w:ilvl="1" w:tplc="04090003" w:tentative="1">
+      <w:start w:val="1"/>
+      <w:numFmt w:val="bullet"/>
+      <w:lvlText w:val="o"/>
+      <w:lvlJc w:val="left"/>
+      <w:pPr>
+        <w:ind w:left="4320" w:hanging="360"/>
+      </w:pPr>
+      <w:rPr>
+        <w:rFonts w:ascii="Courier New" w:hAnsi="Courier New" w:cs="Courier New" w:hint="default"/>
+      </w:rPr>
+    </w:lvl>
+    <w:lvl w:ilvl="2" w:tplc="04090005" w:tentative="1">
+      <w:start w:val="1"/>
+      <w:numFmt w:val="bullet"/>
+      <w:lvlText w:val=""/>
+      <w:lvlJc w:val="left"/>
+      <w:pPr>
+        <w:ind w:left="5040" w:hanging="360"/>
+      </w:pPr>
+      <w:rPr>
+        <w:rFonts w:ascii="Wingdings" w:hAnsi="Wingdings" w:hint="default"/>
+      </w:rPr>
+    </w:lvl>
+    <w:lvl w:ilvl="3" w:tplc="04090001" w:tentative="1">
+      <w:start w:val="1"/>
+      <w:numFmt w:val="bullet"/>
+      <w:lvlText w:val=""/>
+      <w:lvlJc w:val="left"/>
+      <w:pPr>
+        <w:ind w:left="5760" w:hanging="360"/>
+      </w:pPr>
+      <w:rPr>
+        <w:rFonts w:ascii="Symbol" w:hAnsi="Symbol" w:hint="default"/>
+      </w:rPr>
+    </w:lvl>
+    <w:lvl w:ilvl="4" w:tplc="04090003" w:tentative="1">
+      <w:start w:val="1"/>
+      <w:numFmt w:val="bullet"/>
+      <w:lvlText w:val="o"/>
+      <w:lvlJc w:val="left"/>
+      <w:pPr>
+        <w:ind w:left="6480" w:hanging="360"/>
+      </w:pPr>
+      <w:rPr>
+        <w:rFonts w:ascii="Courier New" w:hAnsi="Courier New" w:cs="Courier New" w:hint="default"/>
+      </w:rPr>
+    </w:lvl>
+    <w:lvl w:ilvl="5" w:tplc="04090005" w:tentative="1">
+      <w:start w:val="1"/>
+      <w:numFmt w:val="bullet"/>
+      <w:lvlText w:val=""/>
+      <w:lvlJc w:val="left"/>
+      <w:pPr>
+        <w:ind w:left="7200" w:hanging="360"/>
+      </w:pPr>
+      <w:rPr>
+        <w:rFonts w:ascii="Wingdings" w:hAnsi="Wingdings" w:hint="default"/>
+      </w:rPr>
+    </w:lvl>
+    <w:lvl w:ilvl="6" w:tplc="04090001" w:tentative="1">
+      <w:start w:val="1"/>
+      <w:numFmt w:val="bullet"/>
+      <w:lvlText w:val=""/>
+      <w:lvlJc w:val="left"/>
+      <w:pPr>
+        <w:ind w:left="7920" w:hanging="360"/>
+      </w:pPr>
+      <w:rPr>
+        <w:rFonts w:ascii="Symbol" w:hAnsi="Symbol" w:hint="default"/>
+      </w:rPr>
+    </w:lvl>
+    <w:lvl w:ilvl="7" w:tplc="04090003" w:tentative="1">
+      <w:start w:val="1"/>
+      <w:numFmt w:val="bullet"/>
+      <w:lvlText w:val="o"/>
+      <w:lvlJc w:val="left"/>
+      <w:pPr>
+        <w:ind w:left="8640" w:hanging="360"/>
+      </w:pPr>
+      <w:rPr>
+        <w:rFonts w:ascii="Courier New" w:hAnsi="Courier New" w:cs="Courier New" w:hint="default"/>
+      </w:rPr>
+    </w:lvl>
+    <w:lvl w:ilvl="8" w:tplc="04090005" w:tentative="1">
+      <w:start w:val="1"/>
+      <w:numFmt w:val="bullet"/>
+      <w:lvlText w:val=""/>
+      <w:lvlJc w:val="left"/>
+      <w:pPr>
+        <w:ind w:left="9360" w:hanging="360"/>
+      </w:pPr>
+      <w:rPr>
+        <w:rFonts w:ascii="Wingdings" w:hAnsi="Wingdings" w:hint="default"/>
+      </w:rPr>
+    </w:lvl>
+  </w:abstractNum>
+  <w:abstractNum w:abstractNumId="16" w15:restartNumberingAfterBreak="0">
     <w:nsid w:val="30085D61"/>
     <w:multiLevelType w:val="hybridMultilevel"/>
     <w:tmpl w:val="3C284E3A"/>
@@ -14673,7 +16393,7 @@
       </w:rPr>
     </w:lvl>
   </w:abstractNum>
-  <w:abstractNum w:abstractNumId="15" w15:restartNumberingAfterBreak="0">
+  <w:abstractNum w:abstractNumId="17" w15:restartNumberingAfterBreak="0">
     <w:nsid w:val="307527B3"/>
     <w:multiLevelType w:val="hybridMultilevel"/>
     <w:tmpl w:val="E76464F2"/>
@@ -14762,7 +16482,7 @@
       </w:pPr>
     </w:lvl>
   </w:abstractNum>
-  <w:abstractNum w:abstractNumId="16" w15:restartNumberingAfterBreak="0">
+  <w:abstractNum w:abstractNumId="18" w15:restartNumberingAfterBreak="0">
     <w:nsid w:val="34056BD4"/>
     <w:multiLevelType w:val="hybridMultilevel"/>
     <w:tmpl w:val="C82E186E"/>
@@ -14848,7 +16568,7 @@
       </w:pPr>
     </w:lvl>
   </w:abstractNum>
-  <w:abstractNum w:abstractNumId="17" w15:restartNumberingAfterBreak="0">
+  <w:abstractNum w:abstractNumId="19" w15:restartNumberingAfterBreak="0">
     <w:nsid w:val="375038A2"/>
     <w:multiLevelType w:val="hybridMultilevel"/>
     <w:tmpl w:val="9A4CC9FE"/>
@@ -14961,7 +16681,7 @@
       </w:rPr>
     </w:lvl>
   </w:abstractNum>
-  <w:abstractNum w:abstractNumId="18" w15:restartNumberingAfterBreak="0">
+  <w:abstractNum w:abstractNumId="20" w15:restartNumberingAfterBreak="0">
     <w:nsid w:val="38D213B9"/>
     <w:multiLevelType w:val="hybridMultilevel"/>
     <w:tmpl w:val="A4364AD6"/>
@@ -15047,7 +16767,7 @@
       </w:pPr>
     </w:lvl>
   </w:abstractNum>
-  <w:abstractNum w:abstractNumId="19" w15:restartNumberingAfterBreak="0">
+  <w:abstractNum w:abstractNumId="21" w15:restartNumberingAfterBreak="0">
     <w:nsid w:val="3B8356F1"/>
     <w:multiLevelType w:val="hybridMultilevel"/>
     <w:tmpl w:val="8EEEBB50"/>
@@ -15136,7 +16856,7 @@
       </w:pPr>
     </w:lvl>
   </w:abstractNum>
-  <w:abstractNum w:abstractNumId="20" w15:restartNumberingAfterBreak="0">
+  <w:abstractNum w:abstractNumId="22" w15:restartNumberingAfterBreak="0">
     <w:nsid w:val="3BAA25E5"/>
     <w:multiLevelType w:val="hybridMultilevel"/>
     <w:tmpl w:val="D8C825EC"/>
@@ -15249,7 +16969,7 @@
       </w:rPr>
     </w:lvl>
   </w:abstractNum>
-  <w:abstractNum w:abstractNumId="21" w15:restartNumberingAfterBreak="0">
+  <w:abstractNum w:abstractNumId="23" w15:restartNumberingAfterBreak="0">
     <w:nsid w:val="3DA9465C"/>
     <w:multiLevelType w:val="hybridMultilevel"/>
     <w:tmpl w:val="D056F0EA"/>
@@ -15362,7 +17082,7 @@
       </w:rPr>
     </w:lvl>
   </w:abstractNum>
-  <w:abstractNum w:abstractNumId="22" w15:restartNumberingAfterBreak="0">
+  <w:abstractNum w:abstractNumId="24" w15:restartNumberingAfterBreak="0">
     <w:nsid w:val="484949ED"/>
     <w:multiLevelType w:val="hybridMultilevel"/>
     <w:tmpl w:val="B726C06A"/>
@@ -15451,7 +17171,7 @@
       </w:pPr>
     </w:lvl>
   </w:abstractNum>
-  <w:abstractNum w:abstractNumId="23" w15:restartNumberingAfterBreak="0">
+  <w:abstractNum w:abstractNumId="25" w15:restartNumberingAfterBreak="0">
     <w:nsid w:val="4D9503E4"/>
     <w:multiLevelType w:val="hybridMultilevel"/>
     <w:tmpl w:val="C03C3DF2"/>
@@ -15542,7 +17262,7 @@
       </w:pPr>
     </w:lvl>
   </w:abstractNum>
-  <w:abstractNum w:abstractNumId="24" w15:restartNumberingAfterBreak="0">
+  <w:abstractNum w:abstractNumId="26" w15:restartNumberingAfterBreak="0">
     <w:nsid w:val="4E1F4DAD"/>
     <w:multiLevelType w:val="hybridMultilevel"/>
     <w:tmpl w:val="3D241A32"/>
@@ -15655,7 +17375,7 @@
       </w:rPr>
     </w:lvl>
   </w:abstractNum>
-  <w:abstractNum w:abstractNumId="25" w15:restartNumberingAfterBreak="0">
+  <w:abstractNum w:abstractNumId="27" w15:restartNumberingAfterBreak="0">
     <w:nsid w:val="522C29FE"/>
     <w:multiLevelType w:val="hybridMultilevel"/>
     <w:tmpl w:val="74426494"/>
@@ -15768,7 +17488,120 @@
       </w:rPr>
     </w:lvl>
   </w:abstractNum>
-  <w:abstractNum w:abstractNumId="26" w15:restartNumberingAfterBreak="0">
+  <w:abstractNum w:abstractNumId="28" w15:restartNumberingAfterBreak="0">
+    <w:nsid w:val="5B482414"/>
+    <w:multiLevelType w:val="hybridMultilevel"/>
+    <w:tmpl w:val="9698DA2A"/>
+    <w:lvl w:ilvl="0" w:tplc="04090001">
+      <w:start w:val="1"/>
+      <w:numFmt w:val="bullet"/>
+      <w:lvlText w:val=""/>
+      <w:lvlJc w:val="left"/>
+      <w:pPr>
+        <w:ind w:left="720" w:hanging="360"/>
+      </w:pPr>
+      <w:rPr>
+        <w:rFonts w:ascii="Symbol" w:hAnsi="Symbol" w:hint="default"/>
+      </w:rPr>
+    </w:lvl>
+    <w:lvl w:ilvl="1" w:tplc="04090003" w:tentative="1">
+      <w:start w:val="1"/>
+      <w:numFmt w:val="bullet"/>
+      <w:lvlText w:val="o"/>
+      <w:lvlJc w:val="left"/>
+      <w:pPr>
+        <w:ind w:left="1440" w:hanging="360"/>
+      </w:pPr>
+      <w:rPr>
+        <w:rFonts w:ascii="Courier New" w:hAnsi="Courier New" w:cs="Courier New" w:hint="default"/>
+      </w:rPr>
+    </w:lvl>
+    <w:lvl w:ilvl="2" w:tplc="04090005" w:tentative="1">
+      <w:start w:val="1"/>
+      <w:numFmt w:val="bullet"/>
+      <w:lvlText w:val=""/>
+      <w:lvlJc w:val="left"/>
+      <w:pPr>
+        <w:ind w:left="2160" w:hanging="360"/>
+      </w:pPr>
+      <w:rPr>
+        <w:rFonts w:ascii="Wingdings" w:hAnsi="Wingdings" w:hint="default"/>
+      </w:rPr>
+    </w:lvl>
+    <w:lvl w:ilvl="3" w:tplc="04090001" w:tentative="1">
+      <w:start w:val="1"/>
+      <w:numFmt w:val="bullet"/>
+      <w:lvlText w:val=""/>
+      <w:lvlJc w:val="left"/>
+      <w:pPr>
+        <w:ind w:left="2880" w:hanging="360"/>
+      </w:pPr>
+      <w:rPr>
+        <w:rFonts w:ascii="Symbol" w:hAnsi="Symbol" w:hint="default"/>
+      </w:rPr>
+    </w:lvl>
+    <w:lvl w:ilvl="4" w:tplc="04090003" w:tentative="1">
+      <w:start w:val="1"/>
+      <w:numFmt w:val="bullet"/>
+      <w:lvlText w:val="o"/>
+      <w:lvlJc w:val="left"/>
+      <w:pPr>
+        <w:ind w:left="3600" w:hanging="360"/>
+      </w:pPr>
+      <w:rPr>
+        <w:rFonts w:ascii="Courier New" w:hAnsi="Courier New" w:cs="Courier New" w:hint="default"/>
+      </w:rPr>
+    </w:lvl>
+    <w:lvl w:ilvl="5" w:tplc="04090005" w:tentative="1">
+      <w:start w:val="1"/>
+      <w:numFmt w:val="bullet"/>
+      <w:lvlText w:val=""/>
+      <w:lvlJc w:val="left"/>
+      <w:pPr>
+        <w:ind w:left="4320" w:hanging="360"/>
+      </w:pPr>
+      <w:rPr>
+        <w:rFonts w:ascii="Wingdings" w:hAnsi="Wingdings" w:hint="default"/>
+      </w:rPr>
+    </w:lvl>
+    <w:lvl w:ilvl="6" w:tplc="04090001" w:tentative="1">
+      <w:start w:val="1"/>
+      <w:numFmt w:val="bullet"/>
+      <w:lvlText w:val=""/>
+      <w:lvlJc w:val="left"/>
+      <w:pPr>
+        <w:ind w:left="5040" w:hanging="360"/>
+      </w:pPr>
+      <w:rPr>
+        <w:rFonts w:ascii="Symbol" w:hAnsi="Symbol" w:hint="default"/>
+      </w:rPr>
+    </w:lvl>
+    <w:lvl w:ilvl="7" w:tplc="04090003" w:tentative="1">
+      <w:start w:val="1"/>
+      <w:numFmt w:val="bullet"/>
+      <w:lvlText w:val="o"/>
+      <w:lvlJc w:val="left"/>
+      <w:pPr>
+        <w:ind w:left="5760" w:hanging="360"/>
+      </w:pPr>
+      <w:rPr>
+        <w:rFonts w:ascii="Courier New" w:hAnsi="Courier New" w:cs="Courier New" w:hint="default"/>
+      </w:rPr>
+    </w:lvl>
+    <w:lvl w:ilvl="8" w:tplc="04090005" w:tentative="1">
+      <w:start w:val="1"/>
+      <w:numFmt w:val="bullet"/>
+      <w:lvlText w:val=""/>
+      <w:lvlJc w:val="left"/>
+      <w:pPr>
+        <w:ind w:left="6480" w:hanging="360"/>
+      </w:pPr>
+      <w:rPr>
+        <w:rFonts w:ascii="Wingdings" w:hAnsi="Wingdings" w:hint="default"/>
+      </w:rPr>
+    </w:lvl>
+  </w:abstractNum>
+  <w:abstractNum w:abstractNumId="29" w15:restartNumberingAfterBreak="0">
     <w:nsid w:val="5C480982"/>
     <w:multiLevelType w:val="hybridMultilevel"/>
     <w:tmpl w:val="A21A3238"/>
@@ -15881,7 +17714,7 @@
       </w:rPr>
     </w:lvl>
   </w:abstractNum>
-  <w:abstractNum w:abstractNumId="27" w15:restartNumberingAfterBreak="0">
+  <w:abstractNum w:abstractNumId="30" w15:restartNumberingAfterBreak="0">
     <w:nsid w:val="5D2A6FAF"/>
     <w:multiLevelType w:val="hybridMultilevel"/>
     <w:tmpl w:val="B5AE7E34"/>
@@ -15993,7 +17826,120 @@
       </w:rPr>
     </w:lvl>
   </w:abstractNum>
-  <w:abstractNum w:abstractNumId="28" w15:restartNumberingAfterBreak="0">
+  <w:abstractNum w:abstractNumId="31" w15:restartNumberingAfterBreak="0">
+    <w:nsid w:val="5DA0128B"/>
+    <w:multiLevelType w:val="hybridMultilevel"/>
+    <w:tmpl w:val="84344A7E"/>
+    <w:lvl w:ilvl="0" w:tplc="04090001">
+      <w:start w:val="1"/>
+      <w:numFmt w:val="bullet"/>
+      <w:lvlText w:val=""/>
+      <w:lvlJc w:val="left"/>
+      <w:pPr>
+        <w:ind w:left="720" w:hanging="360"/>
+      </w:pPr>
+      <w:rPr>
+        <w:rFonts w:ascii="Symbol" w:hAnsi="Symbol" w:hint="default"/>
+      </w:rPr>
+    </w:lvl>
+    <w:lvl w:ilvl="1" w:tplc="04090003">
+      <w:start w:val="1"/>
+      <w:numFmt w:val="bullet"/>
+      <w:lvlText w:val="o"/>
+      <w:lvlJc w:val="left"/>
+      <w:pPr>
+        <w:ind w:left="1440" w:hanging="360"/>
+      </w:pPr>
+      <w:rPr>
+        <w:rFonts w:ascii="Courier New" w:hAnsi="Courier New" w:cs="Courier New" w:hint="default"/>
+      </w:rPr>
+    </w:lvl>
+    <w:lvl w:ilvl="2" w:tplc="04090005" w:tentative="1">
+      <w:start w:val="1"/>
+      <w:numFmt w:val="bullet"/>
+      <w:lvlText w:val=""/>
+      <w:lvlJc w:val="left"/>
+      <w:pPr>
+        <w:ind w:left="2160" w:hanging="360"/>
+      </w:pPr>
+      <w:rPr>
+        <w:rFonts w:ascii="Wingdings" w:hAnsi="Wingdings" w:hint="default"/>
+      </w:rPr>
+    </w:lvl>
+    <w:lvl w:ilvl="3" w:tplc="04090001" w:tentative="1">
+      <w:start w:val="1"/>
+      <w:numFmt w:val="bullet"/>
+      <w:lvlText w:val=""/>
+      <w:lvlJc w:val="left"/>
+      <w:pPr>
+        <w:ind w:left="2880" w:hanging="360"/>
+      </w:pPr>
+      <w:rPr>
+        <w:rFonts w:ascii="Symbol" w:hAnsi="Symbol" w:hint="default"/>
+      </w:rPr>
+    </w:lvl>
+    <w:lvl w:ilvl="4" w:tplc="04090003" w:tentative="1">
+      <w:start w:val="1"/>
+      <w:numFmt w:val="bullet"/>
+      <w:lvlText w:val="o"/>
+      <w:lvlJc w:val="left"/>
+      <w:pPr>
+        <w:ind w:left="3600" w:hanging="360"/>
+      </w:pPr>
+      <w:rPr>
+        <w:rFonts w:ascii="Courier New" w:hAnsi="Courier New" w:cs="Courier New" w:hint="default"/>
+      </w:rPr>
+    </w:lvl>
+    <w:lvl w:ilvl="5" w:tplc="04090005" w:tentative="1">
+      <w:start w:val="1"/>
+      <w:numFmt w:val="bullet"/>
+      <w:lvlText w:val=""/>
+      <w:lvlJc w:val="left"/>
+      <w:pPr>
+        <w:ind w:left="4320" w:hanging="360"/>
+      </w:pPr>
+      <w:rPr>
+        <w:rFonts w:ascii="Wingdings" w:hAnsi="Wingdings" w:hint="default"/>
+      </w:rPr>
+    </w:lvl>
+    <w:lvl w:ilvl="6" w:tplc="04090001" w:tentative="1">
+      <w:start w:val="1"/>
+      <w:numFmt w:val="bullet"/>
+      <w:lvlText w:val=""/>
+      <w:lvlJc w:val="left"/>
+      <w:pPr>
+        <w:ind w:left="5040" w:hanging="360"/>
+      </w:pPr>
+      <w:rPr>
+        <w:rFonts w:ascii="Symbol" w:hAnsi="Symbol" w:hint="default"/>
+      </w:rPr>
+    </w:lvl>
+    <w:lvl w:ilvl="7" w:tplc="04090003" w:tentative="1">
+      <w:start w:val="1"/>
+      <w:numFmt w:val="bullet"/>
+      <w:lvlText w:val="o"/>
+      <w:lvlJc w:val="left"/>
+      <w:pPr>
+        <w:ind w:left="5760" w:hanging="360"/>
+      </w:pPr>
+      <w:rPr>
+        <w:rFonts w:ascii="Courier New" w:hAnsi="Courier New" w:cs="Courier New" w:hint="default"/>
+      </w:rPr>
+    </w:lvl>
+    <w:lvl w:ilvl="8" w:tplc="04090005" w:tentative="1">
+      <w:start w:val="1"/>
+      <w:numFmt w:val="bullet"/>
+      <w:lvlText w:val=""/>
+      <w:lvlJc w:val="left"/>
+      <w:pPr>
+        <w:ind w:left="6480" w:hanging="360"/>
+      </w:pPr>
+      <w:rPr>
+        <w:rFonts w:ascii="Wingdings" w:hAnsi="Wingdings" w:hint="default"/>
+      </w:rPr>
+    </w:lvl>
+  </w:abstractNum>
+  <w:abstractNum w:abstractNumId="32" w15:restartNumberingAfterBreak="0">
     <w:nsid w:val="6614688B"/>
     <w:multiLevelType w:val="hybridMultilevel"/>
     <w:tmpl w:val="9A9A9806"/>
@@ -16106,7 +18052,7 @@
       </w:rPr>
     </w:lvl>
   </w:abstractNum>
-  <w:abstractNum w:abstractNumId="29" w15:restartNumberingAfterBreak="0">
+  <w:abstractNum w:abstractNumId="33" w15:restartNumberingAfterBreak="0">
     <w:nsid w:val="689F709A"/>
     <w:multiLevelType w:val="hybridMultilevel"/>
     <w:tmpl w:val="3E9AFDB0"/>
@@ -16219,7 +18165,7 @@
       </w:rPr>
     </w:lvl>
   </w:abstractNum>
-  <w:abstractNum w:abstractNumId="30" w15:restartNumberingAfterBreak="0">
+  <w:abstractNum w:abstractNumId="34" w15:restartNumberingAfterBreak="0">
     <w:nsid w:val="6B6A1E2A"/>
     <w:multiLevelType w:val="hybridMultilevel"/>
     <w:tmpl w:val="0458059A"/>
@@ -16332,7 +18278,7 @@
       </w:rPr>
     </w:lvl>
   </w:abstractNum>
-  <w:abstractNum w:abstractNumId="31" w15:restartNumberingAfterBreak="0">
+  <w:abstractNum w:abstractNumId="35" w15:restartNumberingAfterBreak="0">
     <w:nsid w:val="6BDC2A0F"/>
     <w:multiLevelType w:val="hybridMultilevel"/>
     <w:tmpl w:val="7FCC328A"/>
@@ -16445,7 +18391,7 @@
       </w:rPr>
     </w:lvl>
   </w:abstractNum>
-  <w:abstractNum w:abstractNumId="32" w15:restartNumberingAfterBreak="0">
+  <w:abstractNum w:abstractNumId="36" w15:restartNumberingAfterBreak="0">
     <w:nsid w:val="710C1AB9"/>
     <w:multiLevelType w:val="hybridMultilevel"/>
     <w:tmpl w:val="BFF8FE20"/>
@@ -16558,7 +18504,7 @@
       </w:rPr>
     </w:lvl>
   </w:abstractNum>
-  <w:abstractNum w:abstractNumId="33" w15:restartNumberingAfterBreak="0">
+  <w:abstractNum w:abstractNumId="37" w15:restartNumberingAfterBreak="0">
     <w:nsid w:val="71D413D5"/>
     <w:multiLevelType w:val="hybridMultilevel"/>
     <w:tmpl w:val="9AD8CA84"/>
@@ -16670,7 +18616,7 @@
       </w:rPr>
     </w:lvl>
   </w:abstractNum>
-  <w:abstractNum w:abstractNumId="34" w15:restartNumberingAfterBreak="0">
+  <w:abstractNum w:abstractNumId="38" w15:restartNumberingAfterBreak="0">
     <w:nsid w:val="756F7823"/>
     <w:multiLevelType w:val="hybridMultilevel"/>
     <w:tmpl w:val="64765930"/>
@@ -16783,7 +18729,7 @@
       </w:rPr>
     </w:lvl>
   </w:abstractNum>
-  <w:abstractNum w:abstractNumId="35" w15:restartNumberingAfterBreak="0">
+  <w:abstractNum w:abstractNumId="39" w15:restartNumberingAfterBreak="0">
     <w:nsid w:val="798B1C8A"/>
     <w:multiLevelType w:val="hybridMultilevel"/>
     <w:tmpl w:val="F8D6B2E2"/>
@@ -16872,7 +18818,7 @@
       </w:pPr>
     </w:lvl>
   </w:abstractNum>
-  <w:abstractNum w:abstractNumId="36" w15:restartNumberingAfterBreak="0">
+  <w:abstractNum w:abstractNumId="40" w15:restartNumberingAfterBreak="0">
     <w:nsid w:val="79911088"/>
     <w:multiLevelType w:val="hybridMultilevel"/>
     <w:tmpl w:val="B89254AA"/>
@@ -16985,7 +18931,7 @@
       </w:rPr>
     </w:lvl>
   </w:abstractNum>
-  <w:abstractNum w:abstractNumId="37" w15:restartNumberingAfterBreak="0">
+  <w:abstractNum w:abstractNumId="41" w15:restartNumberingAfterBreak="0">
     <w:nsid w:val="7E5556B8"/>
     <w:multiLevelType w:val="hybridMultilevel"/>
     <w:tmpl w:val="37C87164"/>
@@ -17099,16 +19045,16 @@
     </w:lvl>
   </w:abstractNum>
   <w:num w:numId="1" w16cid:durableId="1934632031">
-    <w:abstractNumId w:val="35"/>
+    <w:abstractNumId w:val="39"/>
   </w:num>
   <w:num w:numId="2" w16cid:durableId="144322598">
-    <w:abstractNumId w:val="36"/>
+    <w:abstractNumId w:val="40"/>
   </w:num>
   <w:num w:numId="3" w16cid:durableId="279459713">
-    <w:abstractNumId w:val="19"/>
+    <w:abstractNumId w:val="21"/>
   </w:num>
   <w:num w:numId="4" w16cid:durableId="1657106081">
-    <w:abstractNumId w:val="22"/>
+    <w:abstractNumId w:val="24"/>
   </w:num>
   <w:num w:numId="5" w16cid:durableId="1326712334">
     <w:abstractNumId w:val="4"/>
@@ -17117,31 +19063,31 @@
     <w:abstractNumId w:val="6"/>
   </w:num>
   <w:num w:numId="7" w16cid:durableId="1525558506">
-    <w:abstractNumId w:val="24"/>
+    <w:abstractNumId w:val="26"/>
   </w:num>
   <w:num w:numId="8" w16cid:durableId="850493014">
-    <w:abstractNumId w:val="34"/>
+    <w:abstractNumId w:val="38"/>
   </w:num>
   <w:num w:numId="9" w16cid:durableId="1604802902">
     <w:abstractNumId w:val="8"/>
   </w:num>
   <w:num w:numId="10" w16cid:durableId="1836070790">
+    <w:abstractNumId w:val="25"/>
+  </w:num>
+  <w:num w:numId="11" w16cid:durableId="1809350132">
+    <w:abstractNumId w:val="30"/>
+  </w:num>
+  <w:num w:numId="12" w16cid:durableId="1287080009">
+    <w:abstractNumId w:val="34"/>
+  </w:num>
+  <w:num w:numId="13" w16cid:durableId="543568699">
+    <w:abstractNumId w:val="13"/>
+  </w:num>
+  <w:num w:numId="14" w16cid:durableId="709648945">
     <w:abstractNumId w:val="23"/>
   </w:num>
-  <w:num w:numId="11" w16cid:durableId="1809350132">
-    <w:abstractNumId w:val="27"/>
-  </w:num>
-  <w:num w:numId="12" w16cid:durableId="1287080009">
-    <w:abstractNumId w:val="30"/>
-  </w:num>
-  <w:num w:numId="13" w16cid:durableId="543568699">
-    <w:abstractNumId w:val="12"/>
-  </w:num>
-  <w:num w:numId="14" w16cid:durableId="709648945">
-    <w:abstractNumId w:val="21"/>
-  </w:num>
   <w:num w:numId="15" w16cid:durableId="2064256533">
-    <w:abstractNumId w:val="32"/>
+    <w:abstractNumId w:val="36"/>
   </w:num>
   <w:num w:numId="16" w16cid:durableId="2141260341">
     <w:abstractNumId w:val="7"/>
@@ -17153,19 +19099,19 @@
     <w:abstractNumId w:val="5"/>
   </w:num>
   <w:num w:numId="19" w16cid:durableId="269046563">
-    <w:abstractNumId w:val="10"/>
+    <w:abstractNumId w:val="11"/>
   </w:num>
   <w:num w:numId="20" w16cid:durableId="416635631">
-    <w:abstractNumId w:val="25"/>
+    <w:abstractNumId w:val="27"/>
   </w:num>
   <w:num w:numId="21" w16cid:durableId="854998761">
-    <w:abstractNumId w:val="13"/>
+    <w:abstractNumId w:val="14"/>
   </w:num>
   <w:num w:numId="22" w16cid:durableId="134612965">
-    <w:abstractNumId w:val="37"/>
+    <w:abstractNumId w:val="41"/>
   </w:num>
   <w:num w:numId="23" w16cid:durableId="161894447">
-    <w:abstractNumId w:val="31"/>
+    <w:abstractNumId w:val="35"/>
   </w:num>
   <w:num w:numId="24" w16cid:durableId="1999796368">
     <w:abstractNumId w:val="2"/>
@@ -17177,40 +19123,52 @@
     <w:abstractNumId w:val="0"/>
   </w:num>
   <w:num w:numId="27" w16cid:durableId="1797285986">
+    <w:abstractNumId w:val="20"/>
+  </w:num>
+  <w:num w:numId="28" w16cid:durableId="1468476322">
     <w:abstractNumId w:val="18"/>
   </w:num>
-  <w:num w:numId="28" w16cid:durableId="1468476322">
-    <w:abstractNumId w:val="16"/>
-  </w:num>
   <w:num w:numId="29" w16cid:durableId="1851529987">
-    <w:abstractNumId w:val="20"/>
+    <w:abstractNumId w:val="22"/>
   </w:num>
   <w:num w:numId="30" w16cid:durableId="1539665835">
-    <w:abstractNumId w:val="14"/>
+    <w:abstractNumId w:val="16"/>
   </w:num>
   <w:num w:numId="31" w16cid:durableId="703017086">
     <w:abstractNumId w:val="3"/>
   </w:num>
   <w:num w:numId="32" w16cid:durableId="1247304767">
+    <w:abstractNumId w:val="19"/>
+  </w:num>
+  <w:num w:numId="33" w16cid:durableId="967584561">
+    <w:abstractNumId w:val="37"/>
+  </w:num>
+  <w:num w:numId="34" w16cid:durableId="1521702928">
+    <w:abstractNumId w:val="12"/>
+  </w:num>
+  <w:num w:numId="35" w16cid:durableId="1464692314">
+    <w:abstractNumId w:val="32"/>
+  </w:num>
+  <w:num w:numId="36" w16cid:durableId="294218208">
     <w:abstractNumId w:val="17"/>
   </w:num>
-  <w:num w:numId="33" w16cid:durableId="967584561">
+  <w:num w:numId="37" w16cid:durableId="507989332">
+    <w:abstractNumId w:val="29"/>
+  </w:num>
+  <w:num w:numId="38" w16cid:durableId="1697342152">
     <w:abstractNumId w:val="33"/>
   </w:num>
-  <w:num w:numId="34" w16cid:durableId="1521702928">
-    <w:abstractNumId w:val="11"/>
+  <w:num w:numId="39" w16cid:durableId="362289025">
+    <w:abstractNumId w:val="31"/>
   </w:num>
-  <w:num w:numId="35" w16cid:durableId="1464692314">
+  <w:num w:numId="40" w16cid:durableId="657266574">
     <w:abstractNumId w:val="28"/>
   </w:num>
-  <w:num w:numId="36" w16cid:durableId="294218208">
+  <w:num w:numId="41" w16cid:durableId="874317858">
     <w:abstractNumId w:val="15"/>
   </w:num>
-  <w:num w:numId="37" w16cid:durableId="507989332">
-    <w:abstractNumId w:val="26"/>
-  </w:num>
-  <w:num w:numId="38" w16cid:durableId="1697342152">
-    <w:abstractNumId w:val="29"/>
+  <w:num w:numId="42" w16cid:durableId="1355692089">
+    <w:abstractNumId w:val="10"/>
   </w:num>
 </w:numbering>
 </file>
@@ -17827,7 +19785,6 @@
   <w:style w:type="character" w:default="1" w:styleId="DefaultParagraphFont">
     <w:name w:val="Default Paragraph Font"/>
     <w:uiPriority w:val="1"/>
-    <w:semiHidden/>
     <w:unhideWhenUsed/>
   </w:style>
   <w:style w:type="table" w:default="1" w:styleId="TableNormal">
@@ -18323,6 +20280,56 @@
       <w:sz w:val="20"/>
     </w:rPr>
   </w:style>
+  <w:style w:type="paragraph" w:customStyle="1" w:styleId="Effect">
+    <w:name w:val="Effect"/>
+    <w:basedOn w:val="Normal"/>
+    <w:link w:val="EffectChar"/>
+    <w:qFormat/>
+    <w:rsid w:val="0021566E"/>
+    <w:pPr>
+      <w:framePr w:hSpace="187" w:wrap="around" w:vAnchor="text" w:hAnchor="text" w:y="1"/>
+      <w:spacing w:after="0" w:line="240" w:lineRule="auto"/>
+      <w:suppressOverlap/>
+    </w:pPr>
+    <w:rPr>
+      <w:i/>
+    </w:rPr>
+  </w:style>
+  <w:style w:type="character" w:customStyle="1" w:styleId="EffectChar">
+    <w:name w:val="Effect Char"/>
+    <w:basedOn w:val="DefaultParagraphFont"/>
+    <w:link w:val="Effect"/>
+    <w:rsid w:val="0021566E"/>
+    <w:rPr>
+      <w:rFonts w:ascii="Arvo" w:hAnsi="Arvo"/>
+      <w:i/>
+    </w:rPr>
+  </w:style>
+  <w:style w:type="paragraph" w:customStyle="1" w:styleId="Code">
+    <w:name w:val="Code"/>
+    <w:basedOn w:val="Normal"/>
+    <w:link w:val="CodeChar"/>
+    <w:qFormat/>
+    <w:rsid w:val="00AE4AB7"/>
+    <w:pPr>
+      <w:shd w:val="clear" w:color="auto" w:fill="DAE9F7" w:themeFill="text2" w:themeFillTint="1A"/>
+    </w:pPr>
+    <w:rPr>
+      <w:rFonts w:ascii="Consolas" w:hAnsi="Consolas" w:cs="Cambria Math"/>
+      <w:color w:val="0E2841" w:themeColor="text2"/>
+    </w:rPr>
+  </w:style>
+  <w:style w:type="character" w:customStyle="1" w:styleId="CodeChar">
+    <w:name w:val="Code Char"/>
+    <w:basedOn w:val="DefaultParagraphFont"/>
+    <w:link w:val="Code"/>
+    <w:rsid w:val="00AE4AB7"/>
+    <w:rPr>
+      <w:rFonts w:ascii="Consolas" w:hAnsi="Consolas" w:cs="Cambria Math"/>
+      <w:color w:val="0E2841" w:themeColor="text2"/>
+      <w:shd w:val="clear" w:color="auto" w:fill="DAE9F7" w:themeFill="text2" w:themeFillTint="1A"/>
+    </w:rPr>
+  </w:style>
 </w:styles>
 </file>
 

</xml_diff>

<commit_message>
Add items, rebalance stuff
</commit_message>
<xml_diff>
--- a/design/character-system.docx
+++ b/design/character-system.docx
@@ -1648,7 +1648,7 @@
         <w:t xml:space="preserve">start at </w:t>
       </w:r>
       <w:r>
-        <w:t>1</w:t>
+        <w:t>0</w:t>
       </w:r>
       <w:r>
         <w:t>.</w:t>
@@ -1657,7 +1657,28 @@
         <w:t xml:space="preserve"> They are </w:t>
       </w:r>
       <w:r>
-        <w:t>increased by spending Attribute Points.</w:t>
+        <w:t xml:space="preserve">increased by </w:t>
+      </w:r>
+      <w:r>
+        <w:t xml:space="preserve">investing </w:t>
+      </w:r>
+      <w:r>
+        <w:t>Attribute Points.</w:t>
+      </w:r>
+      <w:r>
+        <w:t xml:space="preserve"> Y</w:t>
+      </w:r>
+      <w:r>
+        <w:t xml:space="preserve">ou can have a maximum of 3 </w:t>
+      </w:r>
+      <w:r>
+        <w:t xml:space="preserve">points in any </w:t>
+      </w:r>
+      <w:r>
+        <w:t>Attribute</w:t>
+      </w:r>
+      <w:r>
+        <w:t>.</w:t>
       </w:r>
     </w:p>
     <w:p>
@@ -3097,45 +3118,31 @@
         <w:tblLook w:val="04A0" w:firstRow="1" w:lastRow="0" w:firstColumn="1" w:lastColumn="0" w:noHBand="0" w:noVBand="1"/>
       </w:tblPr>
       <w:tblGrid>
-        <w:gridCol w:w="3714"/>
-        <w:gridCol w:w="1141"/>
-        <w:gridCol w:w="4495"/>
+        <w:gridCol w:w="2515"/>
+        <w:gridCol w:w="6835"/>
       </w:tblGrid>
       <w:tr>
         <w:tc>
           <w:tcPr>
-            <w:tcW w:w="3714" w:type="dxa"/>
-          </w:tcPr>
-          <w:p>
-            <w:r>
+            <w:tcW w:w="2515" w:type="dxa"/>
+          </w:tcPr>
+          <w:p>
+            <w:pPr>
               <w:rPr>
                 <w:rStyle w:val="Emphasis"/>
               </w:rPr>
+            </w:pPr>
+            <w:r>
+              <w:rPr>
+                <w:rStyle w:val="Emphasis"/>
+              </w:rPr>
               <w:t>Statistic</w:t>
             </w:r>
           </w:p>
         </w:tc>
         <w:tc>
           <w:tcPr>
-            <w:tcW w:w="1141" w:type="dxa"/>
-          </w:tcPr>
-          <w:p>
-            <w:pPr>
-              <w:rPr>
-                <w:rStyle w:val="Emphasis"/>
-              </w:rPr>
-            </w:pPr>
-            <w:r>
-              <w:rPr>
-                <w:rStyle w:val="Emphasis"/>
-              </w:rPr>
-              <w:t>Abbr.</w:t>
-            </w:r>
-          </w:p>
-        </w:tc>
-        <w:tc>
-          <w:tcPr>
-            <w:tcW w:w="4495" w:type="dxa"/>
+            <w:tcW w:w="6835" w:type="dxa"/>
           </w:tcPr>
           <w:p>
             <w:r>
@@ -3153,7 +3160,7 @@
         </w:trPr>
         <w:tc>
           <w:tcPr>
-            <w:tcW w:w="3714" w:type="dxa"/>
+            <w:tcW w:w="2515" w:type="dxa"/>
           </w:tcPr>
           <w:p>
             <w:r>
@@ -3163,17 +3170,7 @@
         </w:tc>
         <w:tc>
           <w:tcPr>
-            <w:tcW w:w="1141" w:type="dxa"/>
-          </w:tcPr>
-          <w:p>
-            <w:r>
-              <w:t>H</w:t>
-            </w:r>
-          </w:p>
-        </w:tc>
-        <w:tc>
-          <w:tcPr>
-            <w:tcW w:w="4495" w:type="dxa"/>
+            <w:tcW w:w="6835" w:type="dxa"/>
           </w:tcPr>
           <w:p>
             <w:r>
@@ -3185,7 +3182,7 @@
       <w:tr>
         <w:tc>
           <w:tcPr>
-            <w:tcW w:w="3714" w:type="dxa"/>
+            <w:tcW w:w="2515" w:type="dxa"/>
           </w:tcPr>
           <w:p>
             <w:r>
@@ -3195,30 +3192,11 @@
         </w:tc>
         <w:tc>
           <w:tcPr>
-            <w:tcW w:w="1141" w:type="dxa"/>
-          </w:tcPr>
-          <w:p>
-            <w:r>
-              <w:t>A</w:t>
-            </w:r>
-          </w:p>
-        </w:tc>
-        <w:tc>
-          <w:tcPr>
-            <w:tcW w:w="4495" w:type="dxa"/>
-          </w:tcPr>
-          <w:p>
-            <w:r>
-              <w:t>C</w:t>
-            </w:r>
-            <w:r>
-              <w:t xml:space="preserve">hance to hit </w:t>
-            </w:r>
-            <w:r>
-              <w:t>targets</w:t>
-            </w:r>
-            <w:r>
-              <w:t xml:space="preserve"> during an attack roll</w:t>
+            <w:tcW w:w="6835" w:type="dxa"/>
+          </w:tcPr>
+          <w:p>
+            <w:r>
+              <w:t>Chance to hit targets during an attack roll</w:t>
             </w:r>
           </w:p>
           <w:p>
@@ -3233,8 +3211,51 @@
                 <w:i/>
                 <w:iCs/>
               </w:rPr>
-              <w:t>6 + (Brawn + Agility) / 2</w:t>
-            </w:r>
+              <w:t xml:space="preserve">2D6 + </w:t>
+            </w:r>
+            <w:r>
+              <w:rPr>
+                <w:i/>
+                <w:iCs/>
+              </w:rPr>
+              <w:t>Brawn</w:t>
+            </w:r>
+            <w:r>
+              <w:rPr>
+                <w:i/>
+                <w:iCs/>
+              </w:rPr>
+              <w:t xml:space="preserve"> + </w:t>
+            </w:r>
+            <w:r>
+              <w:rPr>
+                <w:i/>
+                <w:iCs/>
+              </w:rPr>
+              <w:t xml:space="preserve">Attack </w:t>
+            </w:r>
+            <w:r>
+              <w:rPr>
+                <w:i/>
+                <w:iCs/>
+              </w:rPr>
+              <w:t>Modifier</w:t>
+            </w:r>
+            <w:r>
+              <w:rPr>
+                <w:i/>
+                <w:iCs/>
+              </w:rPr>
+              <w:t xml:space="preserve"> (from Weapon)</w:t>
+            </w:r>
+          </w:p>
+          <w:p>
+            <w:pPr>
+              <w:rPr>
+                <w:i/>
+                <w:iCs/>
+              </w:rPr>
+            </w:pPr>
           </w:p>
         </w:tc>
       </w:tr>
@@ -3244,7 +3265,7 @@
         </w:trPr>
         <w:tc>
           <w:tcPr>
-            <w:tcW w:w="3714" w:type="dxa"/>
+            <w:tcW w:w="2515" w:type="dxa"/>
           </w:tcPr>
           <w:p>
             <w:r>
@@ -3254,27 +3275,14 @@
         </w:tc>
         <w:tc>
           <w:tcPr>
-            <w:tcW w:w="1141" w:type="dxa"/>
-          </w:tcPr>
-          <w:p>
-            <w:r>
-              <w:t>D</w:t>
-            </w:r>
-          </w:p>
-        </w:tc>
-        <w:tc>
-          <w:tcPr>
-            <w:tcW w:w="4495" w:type="dxa"/>
-          </w:tcPr>
-          <w:p>
-            <w:r>
-              <w:t>C</w:t>
-            </w:r>
-            <w:r>
-              <w:t>hance to avoid physical attacks</w:t>
-            </w:r>
-            <w:r>
-              <w:t xml:space="preserve"> when the target of an attack</w:t>
+            <w:tcW w:w="6835" w:type="dxa"/>
+          </w:tcPr>
+          <w:p>
+            <w:r>
+              <w:t>Chance to avoid physical attacks when attack</w:t>
+            </w:r>
+            <w:r>
+              <w:t>ed</w:t>
             </w:r>
           </w:p>
           <w:p>
@@ -3289,14 +3297,35 @@
                 <w:i/>
                 <w:iCs/>
               </w:rPr>
-              <w:t xml:space="preserve">6 + </w:t>
+              <w:t xml:space="preserve">Defense (from Armor) </w:t>
             </w:r>
             <w:r>
               <w:rPr>
                 <w:i/>
                 <w:iCs/>
               </w:rPr>
-              <w:t>Brawn</w:t>
+              <w:t xml:space="preserve">+ </w:t>
+            </w:r>
+            <w:r>
+              <w:rPr>
+                <w:i/>
+                <w:iCs/>
+              </w:rPr>
+              <w:t>(</w:t>
+            </w:r>
+            <w:r>
+              <w:rPr>
+                <w:i/>
+                <w:iCs/>
+              </w:rPr>
+              <w:t>Agility</w:t>
+            </w:r>
+            <w:r>
+              <w:rPr>
+                <w:i/>
+                <w:iCs/>
+              </w:rPr>
+              <w:t xml:space="preserve"> / 2)</w:t>
             </w:r>
           </w:p>
         </w:tc>
@@ -3304,7 +3333,7 @@
       <w:tr>
         <w:tc>
           <w:tcPr>
-            <w:tcW w:w="3714" w:type="dxa"/>
+            <w:tcW w:w="2515" w:type="dxa"/>
           </w:tcPr>
           <w:p>
             <w:r>
@@ -3314,17 +3343,7 @@
         </w:tc>
         <w:tc>
           <w:tcPr>
-            <w:tcW w:w="1141" w:type="dxa"/>
-          </w:tcPr>
-          <w:p>
-            <w:r>
-              <w:t>C</w:t>
-            </w:r>
-          </w:p>
-        </w:tc>
-        <w:tc>
-          <w:tcPr>
-            <w:tcW w:w="4495" w:type="dxa"/>
+            <w:tcW w:w="6835" w:type="dxa"/>
           </w:tcPr>
           <w:p>
             <w:r>
@@ -3361,7 +3380,7 @@
         </w:trPr>
         <w:tc>
           <w:tcPr>
-            <w:tcW w:w="3714" w:type="dxa"/>
+            <w:tcW w:w="2515" w:type="dxa"/>
           </w:tcPr>
           <w:p>
             <w:r>
@@ -3371,23 +3390,7 @@
         </w:tc>
         <w:tc>
           <w:tcPr>
-            <w:tcW w:w="1141" w:type="dxa"/>
-          </w:tcPr>
-          <w:p>
-            <w:r>
-              <w:t>C</w:t>
-            </w:r>
-            <w:r>
-              <w:rPr>
-                <w:vertAlign w:val="superscript"/>
-              </w:rPr>
-              <w:t>M</w:t>
-            </w:r>
-          </w:p>
-        </w:tc>
-        <w:tc>
-          <w:tcPr>
-            <w:tcW w:w="4495" w:type="dxa"/>
+            <w:tcW w:w="6835" w:type="dxa"/>
           </w:tcPr>
           <w:p>
             <w:r>
@@ -3406,7 +3409,7 @@
                 <w:i/>
                 <w:iCs/>
               </w:rPr>
-              <w:t>150</w:t>
+              <w:t>200</w:t>
             </w:r>
             <w:r>
               <w:rPr>
@@ -3421,7 +3424,7 @@
       <w:tr>
         <w:tc>
           <w:tcPr>
-            <w:tcW w:w="3714" w:type="dxa"/>
+            <w:tcW w:w="2515" w:type="dxa"/>
           </w:tcPr>
           <w:p>
             <w:r>
@@ -3431,17 +3434,7 @@
         </w:tc>
         <w:tc>
           <w:tcPr>
-            <w:tcW w:w="1141" w:type="dxa"/>
-          </w:tcPr>
-          <w:p>
-            <w:r>
-              <w:t>G</w:t>
-            </w:r>
-          </w:p>
-        </w:tc>
-        <w:tc>
-          <w:tcPr>
-            <w:tcW w:w="4495" w:type="dxa"/>
+            <w:tcW w:w="6835" w:type="dxa"/>
           </w:tcPr>
           <w:p>
             <w:r>
@@ -3456,7 +3449,7 @@
         </w:trPr>
         <w:tc>
           <w:tcPr>
-            <w:tcW w:w="3714" w:type="dxa"/>
+            <w:tcW w:w="2515" w:type="dxa"/>
           </w:tcPr>
           <w:p>
             <w:r>
@@ -3466,17 +3459,7 @@
         </w:tc>
         <w:tc>
           <w:tcPr>
-            <w:tcW w:w="1141" w:type="dxa"/>
-          </w:tcPr>
-          <w:p>
-            <w:r>
-              <w:t>B</w:t>
-            </w:r>
-          </w:p>
-        </w:tc>
-        <w:tc>
-          <w:tcPr>
-            <w:tcW w:w="4495" w:type="dxa"/>
+            <w:tcW w:w="6835" w:type="dxa"/>
           </w:tcPr>
           <w:p>
             <w:r>
@@ -3488,7 +3471,7 @@
       <w:tr>
         <w:tc>
           <w:tcPr>
-            <w:tcW w:w="3714" w:type="dxa"/>
+            <w:tcW w:w="2515" w:type="dxa"/>
           </w:tcPr>
           <w:p>
             <w:r>
@@ -3498,17 +3481,7 @@
         </w:tc>
         <w:tc>
           <w:tcPr>
-            <w:tcW w:w="1141" w:type="dxa"/>
-          </w:tcPr>
-          <w:p>
-            <w:r>
-              <w:t>M</w:t>
-            </w:r>
-          </w:p>
-        </w:tc>
-        <w:tc>
-          <w:tcPr>
-            <w:tcW w:w="4495" w:type="dxa"/>
+            <w:tcW w:w="6835" w:type="dxa"/>
           </w:tcPr>
           <w:p>
             <w:r>
@@ -10365,14 +10338,7 @@
           <w:i/>
           <w:iCs/>
         </w:rPr>
-        <w:t>×</w:t>
-      </w:r>
-      <w:r>
-        <w:rPr>
-          <w:i/>
-          <w:iCs/>
-        </w:rPr>
-        <w:t xml:space="preserve"> </w:t>
+        <w:t xml:space="preserve">× </w:t>
       </w:r>
       <w:r>
         <w:rPr>
@@ -10420,6 +10386,18 @@
       </w:r>
     </w:p>
     <w:p>
+      <w:r>
+        <w:rPr>
+          <w:u w:val="single"/>
+        </w:rPr>
+        <w:t>Tattoos</w:t>
+      </w:r>
+      <w:r>
+        <w:t>?</w:t>
+      </w:r>
+      <w:r>
+        <w:t xml:space="preserve"> (Idea to replace Scrap Plates)</w:t>
+      </w:r>
       <w:r>
         <w:br w:type="page"/>
       </w:r>
@@ -10596,44 +10574,7 @@
       </w:r>
     </w:p>
     <w:p>
-      <w:r>
-        <w:t xml:space="preserve">The regular Strike action that every character has access to costs one Action and has zero cooldown. However, it also applies </w:t>
-      </w:r>
-      <w:r>
-        <w:t xml:space="preserve">the </w:t>
-      </w:r>
-      <w:r>
-        <w:rPr>
-          <w:i/>
-          <w:iCs/>
-        </w:rPr>
-        <w:t>Winded</w:t>
-      </w:r>
-      <w:r>
-        <w:t xml:space="preserve"> Effect</w:t>
-      </w:r>
-      <w:r>
-        <w:t xml:space="preserve"> (</w:t>
-      </w:r>
-      <w:r>
-        <w:t xml:space="preserve">essentially the </w:t>
-      </w:r>
-      <w:r>
-        <w:t>Multiple Action Penalty from Pathfinder).</w:t>
-      </w:r>
-      <w:r>
-        <w:t xml:space="preserve"> This is to discourage players from just striking</w:t>
-      </w:r>
-      <w:r>
-        <w:t xml:space="preserve"> repeatedly</w:t>
-      </w:r>
-      <w:r>
-        <w:t>, and instead to use their different abilities.</w:t>
-      </w:r>
-    </w:p>
-    <w:p>
-      <w:pPr>
-        <w:pStyle w:val="Heading2"/>
+      <w:pPr>
         <w:sectPr>
           <w:type w:val="continuous"/>
           <w:pgSz w:w="12240" w:h="15840"/>
@@ -10642,6 +10583,43 @@
           <w:docGrid w:linePitch="360"/>
         </w:sectPr>
       </w:pPr>
+      <w:r>
+        <w:t xml:space="preserve">The regular Strike action that every character has access to costs one Action and has zero cooldown. However, it also applies </w:t>
+      </w:r>
+      <w:r>
+        <w:t xml:space="preserve">the </w:t>
+      </w:r>
+      <w:r>
+        <w:rPr>
+          <w:i/>
+          <w:iCs/>
+        </w:rPr>
+        <w:t>Winded</w:t>
+      </w:r>
+      <w:r>
+        <w:t xml:space="preserve"> Effect</w:t>
+      </w:r>
+      <w:r>
+        <w:t xml:space="preserve"> (</w:t>
+      </w:r>
+      <w:r>
+        <w:t xml:space="preserve">essentially the </w:t>
+      </w:r>
+      <w:r>
+        <w:t>Multiple Action Penalty from Pathfinder).</w:t>
+      </w:r>
+      <w:r>
+        <w:t xml:space="preserve"> This is to discourage players from just striking</w:t>
+      </w:r>
+      <w:r>
+        <w:t xml:space="preserve"> repeatedly</w:t>
+      </w:r>
+      <w:r>
+        <w:t>, and instead to use their different abilities</w:t>
+      </w:r>
+      <w:r>
+        <w:t>.</w:t>
+      </w:r>
     </w:p>
     <w:p>
       <w:pPr>
@@ -21179,6 +21157,7 @@
   <w:style w:type="character" w:default="1" w:styleId="DefaultParagraphFont">
     <w:name w:val="Default Paragraph Font"/>
     <w:uiPriority w:val="1"/>
+    <w:semiHidden/>
     <w:unhideWhenUsed/>
   </w:style>
   <w:style w:type="table" w:default="1" w:styleId="TableNormal">

</xml_diff>

<commit_message>
Pause store instead of passing variables
</commit_message>
<xml_diff>
--- a/design/character-system.docx
+++ b/design/character-system.docx
@@ -13734,7 +13734,7 @@
         <w:t>“</w:t>
       </w:r>
       <w:r>
-        <w:t>The wake is but an instrument, waiting to be played</w:t>
+        <w:t>The wake is an instrument, waiting to be played</w:t>
       </w:r>
       <w:r>
         <w:t>.”</w:t>
@@ -13750,11 +13750,9 @@
       <w:r>
         <w:t xml:space="preserve">people that can interact with the </w:t>
       </w:r>
-      <w:proofErr w:type="gramStart"/>
-      <w:r>
-        <w:t>Wake, and</w:t>
-      </w:r>
-      <w:proofErr w:type="gramEnd"/>
+      <w:r>
+        <w:t>Wake and</w:t>
+      </w:r>
       <w:r>
         <w:t xml:space="preserve"> cast </w:t>
       </w:r>
@@ -14165,7 +14163,6 @@
         </w:rPr>
         <w:t xml:space="preserve">Challenge </w:t>
       </w:r>
-      <w:proofErr w:type="gramStart"/>
       <w:r>
         <w:rPr>
           <w:rStyle w:val="Strong"/>
@@ -14178,17 +14175,8 @@
           <w:b w:val="0"/>
           <w:bCs w:val="0"/>
         </w:rPr>
-        <w:t xml:space="preserve">, </w:t>
-      </w:r>
-      <w:r>
-        <w:rPr>
-          <w:rStyle w:val="Strong"/>
-          <w:b w:val="0"/>
-          <w:bCs w:val="0"/>
-        </w:rPr>
-        <w:t>and</w:t>
-      </w:r>
-      <w:proofErr w:type="gramEnd"/>
+        <w:t xml:space="preserve"> and</w:t>
+      </w:r>
       <w:r>
         <w:rPr>
           <w:rStyle w:val="Strong"/>
@@ -14822,11 +14810,9 @@
             <w:r>
               <w:t xml:space="preserve">Curse a </w:t>
             </w:r>
-            <w:proofErr w:type="gramStart"/>
-            <w:r>
-              <w:t>target ,applying</w:t>
-            </w:r>
-            <w:proofErr w:type="gramEnd"/>
+            <w:r>
+              <w:t>target and apply</w:t>
+            </w:r>
             <w:r>
               <w:t xml:space="preserve"> -2 to all their Challenge Rolls for 2</w:t>
             </w:r>

</xml_diff>